<commit_message>
Complete Buổi 9 EDA rubric with train pivot and Seaborn multivariate plot
</commit_message>
<xml_diff>
--- a/ECCC-LITE-FINAL/reports/BaoCao_NOP.docx
+++ b/ECCC-LITE-FINAL/reports/BaoCao_NOP.docx
@@ -1802,7 +1802,7 @@
         </w:rPr>
         <w:t>3.4. Kết quả test cuối</w:t>
         <w:tab/>
-        <w:t>11</w:t>
+        <w:t>12</w:t>
       </w:r>
     </w:p>
     <w:p>
@@ -1822,7 +1822,7 @@
         </w:rPr>
         <w:t>3.5. Kết quả Top-p</w:t>
         <w:tab/>
-        <w:t>12</w:t>
+        <w:t>13</w:t>
       </w:r>
     </w:p>
     <w:p>
@@ -1842,7 +1842,7 @@
         </w:rPr>
         <w:t>3.6. Phân tích False Positive, False Negative và feature importance</w:t>
         <w:tab/>
-        <w:t>13</w:t>
+        <w:t>14</w:t>
       </w:r>
     </w:p>
     <w:p>
@@ -1862,7 +1862,7 @@
         </w:rPr>
         <w:t>3.7. Thảo luận kết quả và giới hạn</w:t>
         <w:tab/>
-        <w:t>14</w:t>
+        <w:t>15</w:t>
       </w:r>
     </w:p>
     <w:p>
@@ -1882,7 +1882,7 @@
         </w:rPr>
         <w:t>PHẦN KẾT LUẬN</w:t>
         <w:tab/>
-        <w:t>15</w:t>
+        <w:t>16</w:t>
       </w:r>
     </w:p>
     <w:p>
@@ -1902,7 +1902,7 @@
         </w:rPr>
         <w:t>PHỤ LỤC A: TỔ CHỨC REPOSITORY VÀ NOTEBOOK</w:t>
         <w:tab/>
-        <w:t>16</w:t>
+        <w:t>17</w:t>
       </w:r>
     </w:p>
     <w:p>
@@ -1922,7 +1922,7 @@
         </w:rPr>
         <w:t>A.1. 01_data_eda.ipynb - Hoan</w:t>
         <w:tab/>
-        <w:t>16</w:t>
+        <w:t>17</w:t>
       </w:r>
     </w:p>
     <w:p>
@@ -1942,7 +1942,7 @@
         </w:rPr>
         <w:t>A.2. 02_modeling.ipynb - Huy</w:t>
         <w:tab/>
-        <w:t>16</w:t>
+        <w:t>17</w:t>
       </w:r>
     </w:p>
     <w:p>
@@ -1962,7 +1962,7 @@
         </w:rPr>
         <w:t>A.3. 03_evaluation.ipynb - Sang</w:t>
         <w:tab/>
-        <w:t>16</w:t>
+        <w:t>17</w:t>
       </w:r>
     </w:p>
     <w:p>
@@ -1982,7 +1982,7 @@
         </w:rPr>
         <w:t>A.4. Fraud_Project_Final.ipynb - cả nhóm</w:t>
         <w:tab/>
-        <w:t>16</w:t>
+        <w:t>17</w:t>
       </w:r>
     </w:p>
     <w:p>
@@ -2002,7 +2002,7 @@
         </w:rPr>
         <w:t>PHỤ LỤC B: PHÂN CÔNG VÀ TRẠNG THÁI HOÀN THÀNH</w:t>
         <w:tab/>
-        <w:t>17</w:t>
+        <w:t>18</w:t>
       </w:r>
     </w:p>
     <w:p>
@@ -2022,7 +2022,7 @@
         </w:rPr>
         <w:t>TÀI LIỆU THAM KHẢO</w:t>
         <w:tab/>
-        <w:t>18</w:t>
+        <w:t>19</w:t>
       </w:r>
       <w:r>
         <w:fldChar w:fldCharType="end"/>
@@ -2035,8 +2035,8 @@
           <w:szCs w:val="26"/>
         </w:rPr>
         <w:sectPr>
-          <w:headerReference w:type="default" r:id="rId35"/>
-          <w:footerReference w:type="default" r:id="rId36"/>
+          <w:headerReference w:type="default" r:id="rId36"/>
+          <w:footerReference w:type="default" r:id="rId37"/>
           <w:pgSz w:w="11906" w:h="16838"/>
           <w:pgMar w:top="1418" w:right="1134" w:bottom="851" w:left="1701" w:header="454" w:footer="340" w:gutter="0"/>
           <w:cols w:space="720"/>
@@ -5566,6 +5566,20 @@
     </w:p>
     <w:p>
       <w:pPr>
+        <w:pStyle w:val="ListBullet"/>
+        <w:spacing w:after="40"/>
+        <w:jc w:val="both"/>
+      </w:pPr>
+      <w:r>
+        <w:rPr>
+          <w:rFonts w:ascii="Times New Roman" w:hAnsi="Times New Roman" w:eastAsia="Times New Roman"/>
+          <w:sz w:val="26"/>
+        </w:rPr>
+        <w:t>Pivot Time × Class và biểu đồ Seaborn đa biến V14, V17, Class, LogAmount chỉ trên train [14].</w:t>
+      </w:r>
+    </w:p>
+    <w:p>
+      <w:pPr>
         <w:pStyle w:val="Heading2"/>
         <w:keepNext/>
       </w:pPr>
@@ -7670,7 +7684,7 @@
       <w:r>
         <w:drawing>
           <wp:inline xmlns:a="http://schemas.openxmlformats.org/drawingml/2006/main" xmlns:pic="http://schemas.openxmlformats.org/drawingml/2006/picture">
-            <wp:extent cx="5394960" cy="3437112"/>
+            <wp:extent cx="5394960" cy="3425647"/>
             <wp:docPr id="1149450717" name="Picture 1149450717" descr="Hình 3.1. Phân bố Class trên train"/>
             <wp:cNvGraphicFramePr>
               <a:graphicFrameLocks noChangeAspect="1"/>
@@ -7691,7 +7705,7 @@
                   <pic:spPr>
                     <a:xfrm>
                       <a:off x="0" y="0"/>
-                      <a:ext cx="5394960" cy="3437112"/>
+                      <a:ext cx="5394960" cy="3425647"/>
                     </a:xfrm>
                     <a:prstGeom prst="rect"/>
                   </pic:spPr>
@@ -7713,7 +7727,7 @@
           <w:i/>
           <w:sz w:val="26"/>
         </w:rPr>
-        <w:t>Train chỉ có 284 fraud trên 170.235 giao dịch (0,167%), xác nhận Accuracy đơn lẻ không phù hợp để chọn mô hình.</w:t>
+        <w:t>Train chỉ có 284 fraud trên 170.235 giao dịch (0,167%). Accuracy đơn lẻ không phù hợp để chọn mô hình vì dự đoán toàn bộ là hợp lệ vẫn cho giá trị cao mà bỏ sót mọi fraud.</w:t>
       </w:r>
     </w:p>
     <w:p>
@@ -7741,7 +7755,7 @@
       <w:r>
         <w:drawing>
           <wp:inline xmlns:a="http://schemas.openxmlformats.org/drawingml/2006/main" xmlns:pic="http://schemas.openxmlformats.org/drawingml/2006/picture">
-            <wp:extent cx="5394960" cy="1986555"/>
+            <wp:extent cx="5394960" cy="1983107"/>
             <wp:docPr id="1149450718" name="Picture 1149450718" descr="Hình 3.2. Amount/LogAmount theo Class"/>
             <wp:cNvGraphicFramePr>
               <a:graphicFrameLocks noChangeAspect="1"/>
@@ -7762,7 +7776,7 @@
                   <pic:spPr>
                     <a:xfrm>
                       <a:off x="0" y="0"/>
-                      <a:ext cx="5394960" cy="1986555"/>
+                      <a:ext cx="5394960" cy="1983107"/>
                     </a:xfrm>
                     <a:prstGeom prst="rect"/>
                   </pic:spPr>
@@ -7812,7 +7826,7 @@
       <w:r>
         <w:drawing>
           <wp:inline xmlns:a="http://schemas.openxmlformats.org/drawingml/2006/main" xmlns:pic="http://schemas.openxmlformats.org/drawingml/2006/picture">
-            <wp:extent cx="5394960" cy="2658679"/>
+            <wp:extent cx="5394960" cy="2657018"/>
             <wp:docPr id="1149450719" name="Picture 1149450719" descr="Hình 3.3. Time theo Class"/>
             <wp:cNvGraphicFramePr>
               <a:graphicFrameLocks noChangeAspect="1"/>
@@ -7833,7 +7847,7 @@
                   <pic:spPr>
                     <a:xfrm>
                       <a:off x="0" y="0"/>
-                      <a:ext cx="5394960" cy="2658679"/>
+                      <a:ext cx="5394960" cy="2657018"/>
                     </a:xfrm>
                     <a:prstGeom prst="rect"/>
                   </pic:spPr>
@@ -7883,7 +7897,7 @@
       <w:r>
         <w:drawing>
           <wp:inline xmlns:a="http://schemas.openxmlformats.org/drawingml/2006/main" xmlns:pic="http://schemas.openxmlformats.org/drawingml/2006/picture">
-            <wp:extent cx="5394960" cy="3675103"/>
+            <wp:extent cx="5394960" cy="3671306"/>
             <wp:docPr id="1149450720" name="Picture 1149450720" descr="Hình 3.4. Tương quan chọn lọc trên train"/>
             <wp:cNvGraphicFramePr>
               <a:graphicFrameLocks noChangeAspect="1"/>
@@ -7904,7 +7918,7 @@
                   <pic:spPr>
                     <a:xfrm>
                       <a:off x="0" y="0"/>
-                      <a:ext cx="5394960" cy="3675103"/>
+                      <a:ext cx="5394960" cy="3671306"/>
                     </a:xfrm>
                     <a:prstGeom prst="rect"/>
                   </pic:spPr>
@@ -7927,6 +7941,701 @@
           <w:sz w:val="26"/>
         </w:rPr>
         <w:t>V17 có |tương quan Pearson| lớn nhất trong bảng chọn lọc (-0,3197). Đây chỉ là liên hệ thống kê trên train; V1-V28 không được gán ý nghĩa nghiệp vụ.</w:t>
+      </w:r>
+    </w:p>
+    <w:p>
+      <w:pPr>
+        <w:pStyle w:val="Caption"/>
+        <w:keepNext/>
+        <w:spacing w:before="100" w:after="60"/>
+        <w:jc w:val="center"/>
+      </w:pPr>
+      <w:r>
+        <w:rPr>
+          <w:rFonts w:ascii="Times New Roman" w:hAnsi="Times New Roman" w:eastAsia="Times New Roman"/>
+          <w:b/>
+          <w:color w:val="000000"/>
+          <w:sz w:val="21"/>
+        </w:rPr>
+        <w:t>Bảng 3.3. Pivot Time theo Class từ từng giao dịch train</w:t>
+      </w:r>
+    </w:p>
+    <w:tbl>
+      <w:tblPr>
+        <w:tblStyle w:val="TableGrid"/>
+        <w:tblW w:type="dxa" w:w="8856"/>
+        <w:jc w:val="left"/>
+        <w:tblLayout w:type="fixed"/>
+        <w:tblLook w:firstColumn="1" w:firstRow="1" w:lastColumn="0" w:lastRow="0" w:noHBand="0" w:noVBand="1" w:val="04A0"/>
+        <w:tblBorders>
+          <w:top w:val="single" w:sz="6" w:color="D9D9D9"/>
+          <w:left w:val="single" w:sz="6" w:color="D9D9D9"/>
+          <w:bottom w:val="single" w:sz="6" w:color="D9D9D9"/>
+          <w:right w:val="single" w:sz="6" w:color="D9D9D9"/>
+          <w:insideH w:val="single" w:sz="6" w:color="D9D9D9"/>
+          <w:insideV w:val="single" w:sz="6" w:color="D9D9D9"/>
+        </w:tblBorders>
+        <w:tblInd w:w="120" w:type="dxa"/>
+      </w:tblPr>
+      <w:tblGrid>
+        <w:gridCol w:w="2300"/>
+        <w:gridCol w:w="2050"/>
+        <w:gridCol w:w="2050"/>
+        <w:gridCol w:w="2456"/>
+      </w:tblGrid>
+      <w:tr>
+        <w:trPr>
+          <w:tblHeader w:val="true"/>
+          <w:cantSplit w:val="true"/>
+        </w:trPr>
+        <w:tc>
+          <w:tcPr>
+            <w:tcW w:type="dxa" w:w="2300"/>
+            <w:shd w:fill="FFFFFF"/>
+            <w:vAlign w:val="center"/>
+            <w:tcMar>
+              <w:top w:w="50" w:type="dxa"/>
+              <w:start w:w="100" w:type="dxa"/>
+              <w:bottom w:w="50" w:type="dxa"/>
+              <w:end w:w="100" w:type="dxa"/>
+            </w:tcMar>
+          </w:tcPr>
+          <w:p>
+            <w:pPr>
+              <w:keepNext/>
+              <w:spacing w:after="0"/>
+              <w:jc w:val="center"/>
+            </w:pPr>
+            <w:r>
+              <w:rPr>
+                <w:rFonts w:ascii="Times New Roman" w:hAnsi="Times New Roman" w:eastAsia="Times New Roman"/>
+                <w:b/>
+                <w:sz w:val="20"/>
+              </w:rPr>
+              <w:t>Time tương đối</w:t>
+            </w:r>
+          </w:p>
+        </w:tc>
+        <w:tc>
+          <w:tcPr>
+            <w:tcW w:type="dxa" w:w="2050"/>
+            <w:shd w:fill="FFFFFF"/>
+            <w:vAlign w:val="center"/>
+            <w:tcMar>
+              <w:top w:w="50" w:type="dxa"/>
+              <w:start w:w="100" w:type="dxa"/>
+              <w:bottom w:w="50" w:type="dxa"/>
+              <w:end w:w="100" w:type="dxa"/>
+            </w:tcMar>
+          </w:tcPr>
+          <w:p>
+            <w:pPr>
+              <w:keepNext/>
+              <w:spacing w:after="0"/>
+              <w:jc w:val="center"/>
+            </w:pPr>
+            <w:r>
+              <w:rPr>
+                <w:rFonts w:ascii="Times New Roman" w:hAnsi="Times New Roman" w:eastAsia="Times New Roman"/>
+                <w:b/>
+                <w:sz w:val="20"/>
+              </w:rPr>
+              <w:t>Class 0</w:t>
+            </w:r>
+          </w:p>
+        </w:tc>
+        <w:tc>
+          <w:tcPr>
+            <w:tcW w:type="dxa" w:w="2050"/>
+            <w:shd w:fill="FFFFFF"/>
+            <w:vAlign w:val="center"/>
+            <w:tcMar>
+              <w:top w:w="50" w:type="dxa"/>
+              <w:start w:w="100" w:type="dxa"/>
+              <w:bottom w:w="50" w:type="dxa"/>
+              <w:end w:w="100" w:type="dxa"/>
+            </w:tcMar>
+          </w:tcPr>
+          <w:p>
+            <w:pPr>
+              <w:keepNext/>
+              <w:spacing w:after="0"/>
+              <w:jc w:val="center"/>
+            </w:pPr>
+            <w:r>
+              <w:rPr>
+                <w:rFonts w:ascii="Times New Roman" w:hAnsi="Times New Roman" w:eastAsia="Times New Roman"/>
+                <w:b/>
+                <w:sz w:val="20"/>
+              </w:rPr>
+              <w:t>Class 1</w:t>
+            </w:r>
+          </w:p>
+        </w:tc>
+        <w:tc>
+          <w:tcPr>
+            <w:tcW w:type="dxa" w:w="2456"/>
+            <w:shd w:fill="FFFFFF"/>
+            <w:vAlign w:val="center"/>
+            <w:tcMar>
+              <w:top w:w="50" w:type="dxa"/>
+              <w:start w:w="100" w:type="dxa"/>
+              <w:bottom w:w="50" w:type="dxa"/>
+              <w:end w:w="100" w:type="dxa"/>
+            </w:tcMar>
+          </w:tcPr>
+          <w:p>
+            <w:pPr>
+              <w:keepNext/>
+              <w:spacing w:after="0"/>
+              <w:jc w:val="center"/>
+            </w:pPr>
+            <w:r>
+              <w:rPr>
+                <w:rFonts w:ascii="Times New Roman" w:hAnsi="Times New Roman" w:eastAsia="Times New Roman"/>
+                <w:b/>
+                <w:sz w:val="20"/>
+              </w:rPr>
+              <w:t>Tỷ lệ fraud</w:t>
+            </w:r>
+          </w:p>
+        </w:tc>
+      </w:tr>
+      <w:tr>
+        <w:trPr>
+          <w:cantSplit w:val="true"/>
+        </w:trPr>
+        <w:tc>
+          <w:tcPr>
+            <w:tcW w:type="dxa" w:w="2300"/>
+            <w:vAlign w:val="center"/>
+            <w:tcMar>
+              <w:top w:w="50" w:type="dxa"/>
+              <w:start w:w="100" w:type="dxa"/>
+              <w:bottom w:w="50" w:type="dxa"/>
+              <w:end w:w="100" w:type="dxa"/>
+            </w:tcMar>
+          </w:tcPr>
+          <w:p>
+            <w:pPr>
+              <w:keepNext/>
+              <w:spacing w:after="0"/>
+              <w:jc w:val="left"/>
+            </w:pPr>
+            <w:r>
+              <w:rPr>
+                <w:rFonts w:ascii="Times New Roman" w:hAnsi="Times New Roman" w:eastAsia="Times New Roman"/>
+                <w:sz w:val="20"/>
+              </w:rPr>
+              <w:t>0–12 giờ</w:t>
+            </w:r>
+          </w:p>
+        </w:tc>
+        <w:tc>
+          <w:tcPr>
+            <w:tcW w:type="dxa" w:w="2050"/>
+            <w:vAlign w:val="center"/>
+            <w:tcMar>
+              <w:top w:w="50" w:type="dxa"/>
+              <w:start w:w="100" w:type="dxa"/>
+              <w:bottom w:w="50" w:type="dxa"/>
+              <w:end w:w="100" w:type="dxa"/>
+            </w:tcMar>
+          </w:tcPr>
+          <w:p>
+            <w:pPr>
+              <w:keepNext/>
+              <w:spacing w:after="0"/>
+              <w:jc w:val="center"/>
+            </w:pPr>
+            <w:r>
+              <w:rPr>
+                <w:rFonts w:ascii="Times New Roman" w:hAnsi="Times New Roman" w:eastAsia="Times New Roman"/>
+                <w:sz w:val="20"/>
+              </w:rPr>
+              <w:t>28257</w:t>
+            </w:r>
+          </w:p>
+        </w:tc>
+        <w:tc>
+          <w:tcPr>
+            <w:tcW w:type="dxa" w:w="2050"/>
+            <w:vAlign w:val="center"/>
+            <w:tcMar>
+              <w:top w:w="50" w:type="dxa"/>
+              <w:start w:w="100" w:type="dxa"/>
+              <w:bottom w:w="50" w:type="dxa"/>
+              <w:end w:w="100" w:type="dxa"/>
+            </w:tcMar>
+          </w:tcPr>
+          <w:p>
+            <w:pPr>
+              <w:keepNext/>
+              <w:spacing w:after="0"/>
+              <w:jc w:val="center"/>
+            </w:pPr>
+            <w:r>
+              <w:rPr>
+                <w:rFonts w:ascii="Times New Roman" w:hAnsi="Times New Roman" w:eastAsia="Times New Roman"/>
+                <w:sz w:val="20"/>
+              </w:rPr>
+              <w:t>91</w:t>
+            </w:r>
+          </w:p>
+        </w:tc>
+        <w:tc>
+          <w:tcPr>
+            <w:tcW w:type="dxa" w:w="2456"/>
+            <w:vAlign w:val="center"/>
+            <w:tcMar>
+              <w:top w:w="50" w:type="dxa"/>
+              <w:start w:w="100" w:type="dxa"/>
+              <w:bottom w:w="50" w:type="dxa"/>
+              <w:end w:w="100" w:type="dxa"/>
+            </w:tcMar>
+          </w:tcPr>
+          <w:p>
+            <w:pPr>
+              <w:keepNext/>
+              <w:spacing w:after="0"/>
+              <w:jc w:val="center"/>
+            </w:pPr>
+            <w:r>
+              <w:rPr>
+                <w:rFonts w:ascii="Times New Roman" w:hAnsi="Times New Roman" w:eastAsia="Times New Roman"/>
+                <w:sz w:val="20"/>
+              </w:rPr>
+              <w:t>0,321%</w:t>
+            </w:r>
+          </w:p>
+        </w:tc>
+      </w:tr>
+      <w:tr>
+        <w:trPr>
+          <w:cantSplit w:val="true"/>
+        </w:trPr>
+        <w:tc>
+          <w:tcPr>
+            <w:tcW w:type="dxa" w:w="2300"/>
+            <w:shd w:fill="FFFFFF"/>
+            <w:vAlign w:val="center"/>
+            <w:tcMar>
+              <w:top w:w="50" w:type="dxa"/>
+              <w:start w:w="100" w:type="dxa"/>
+              <w:bottom w:w="50" w:type="dxa"/>
+              <w:end w:w="100" w:type="dxa"/>
+            </w:tcMar>
+          </w:tcPr>
+          <w:p>
+            <w:pPr>
+              <w:keepNext/>
+              <w:spacing w:after="0"/>
+              <w:jc w:val="left"/>
+            </w:pPr>
+            <w:r>
+              <w:rPr>
+                <w:rFonts w:ascii="Times New Roman" w:hAnsi="Times New Roman" w:eastAsia="Times New Roman"/>
+                <w:sz w:val="20"/>
+              </w:rPr>
+              <w:t>12–24 giờ</w:t>
+            </w:r>
+          </w:p>
+        </w:tc>
+        <w:tc>
+          <w:tcPr>
+            <w:tcW w:type="dxa" w:w="2050"/>
+            <w:shd w:fill="FFFFFF"/>
+            <w:vAlign w:val="center"/>
+            <w:tcMar>
+              <w:top w:w="50" w:type="dxa"/>
+              <w:start w:w="100" w:type="dxa"/>
+              <w:bottom w:w="50" w:type="dxa"/>
+              <w:end w:w="100" w:type="dxa"/>
+            </w:tcMar>
+          </w:tcPr>
+          <w:p>
+            <w:pPr>
+              <w:keepNext/>
+              <w:spacing w:after="0"/>
+              <w:jc w:val="center"/>
+            </w:pPr>
+            <w:r>
+              <w:rPr>
+                <w:rFonts w:ascii="Times New Roman" w:hAnsi="Times New Roman" w:eastAsia="Times New Roman"/>
+                <w:sz w:val="20"/>
+              </w:rPr>
+              <w:t>57895</w:t>
+            </w:r>
+          </w:p>
+        </w:tc>
+        <w:tc>
+          <w:tcPr>
+            <w:tcW w:type="dxa" w:w="2050"/>
+            <w:shd w:fill="FFFFFF"/>
+            <w:vAlign w:val="center"/>
+            <w:tcMar>
+              <w:top w:w="50" w:type="dxa"/>
+              <w:start w:w="100" w:type="dxa"/>
+              <w:bottom w:w="50" w:type="dxa"/>
+              <w:end w:w="100" w:type="dxa"/>
+            </w:tcMar>
+          </w:tcPr>
+          <w:p>
+            <w:pPr>
+              <w:keepNext/>
+              <w:spacing w:after="0"/>
+              <w:jc w:val="center"/>
+            </w:pPr>
+            <w:r>
+              <w:rPr>
+                <w:rFonts w:ascii="Times New Roman" w:hAnsi="Times New Roman" w:eastAsia="Times New Roman"/>
+                <w:sz w:val="20"/>
+              </w:rPr>
+              <w:t>68</w:t>
+            </w:r>
+          </w:p>
+        </w:tc>
+        <w:tc>
+          <w:tcPr>
+            <w:tcW w:type="dxa" w:w="2456"/>
+            <w:shd w:fill="FFFFFF"/>
+            <w:vAlign w:val="center"/>
+            <w:tcMar>
+              <w:top w:w="50" w:type="dxa"/>
+              <w:start w:w="100" w:type="dxa"/>
+              <w:bottom w:w="50" w:type="dxa"/>
+              <w:end w:w="100" w:type="dxa"/>
+            </w:tcMar>
+          </w:tcPr>
+          <w:p>
+            <w:pPr>
+              <w:keepNext/>
+              <w:spacing w:after="0"/>
+              <w:jc w:val="center"/>
+            </w:pPr>
+            <w:r>
+              <w:rPr>
+                <w:rFonts w:ascii="Times New Roman" w:hAnsi="Times New Roman" w:eastAsia="Times New Roman"/>
+                <w:sz w:val="20"/>
+              </w:rPr>
+              <w:t>0,117%</w:t>
+            </w:r>
+          </w:p>
+        </w:tc>
+      </w:tr>
+      <w:tr>
+        <w:trPr>
+          <w:cantSplit w:val="true"/>
+        </w:trPr>
+        <w:tc>
+          <w:tcPr>
+            <w:tcW w:type="dxa" w:w="2300"/>
+            <w:vAlign w:val="center"/>
+            <w:tcMar>
+              <w:top w:w="50" w:type="dxa"/>
+              <w:start w:w="100" w:type="dxa"/>
+              <w:bottom w:w="50" w:type="dxa"/>
+              <w:end w:w="100" w:type="dxa"/>
+            </w:tcMar>
+          </w:tcPr>
+          <w:p>
+            <w:pPr>
+              <w:keepNext/>
+              <w:spacing w:after="0"/>
+              <w:jc w:val="left"/>
+            </w:pPr>
+            <w:r>
+              <w:rPr>
+                <w:rFonts w:ascii="Times New Roman" w:hAnsi="Times New Roman" w:eastAsia="Times New Roman"/>
+                <w:sz w:val="20"/>
+              </w:rPr>
+              <w:t>24–36 giờ</w:t>
+            </w:r>
+          </w:p>
+        </w:tc>
+        <w:tc>
+          <w:tcPr>
+            <w:tcW w:type="dxa" w:w="2050"/>
+            <w:vAlign w:val="center"/>
+            <w:tcMar>
+              <w:top w:w="50" w:type="dxa"/>
+              <w:start w:w="100" w:type="dxa"/>
+              <w:bottom w:w="50" w:type="dxa"/>
+              <w:end w:w="100" w:type="dxa"/>
+            </w:tcMar>
+          </w:tcPr>
+          <w:p>
+            <w:pPr>
+              <w:keepNext/>
+              <w:spacing w:after="0"/>
+              <w:jc w:val="center"/>
+            </w:pPr>
+            <w:r>
+              <w:rPr>
+                <w:rFonts w:ascii="Times New Roman" w:hAnsi="Times New Roman" w:eastAsia="Times New Roman"/>
+                <w:sz w:val="20"/>
+              </w:rPr>
+              <w:t>28303</w:t>
+            </w:r>
+          </w:p>
+        </w:tc>
+        <w:tc>
+          <w:tcPr>
+            <w:tcW w:type="dxa" w:w="2050"/>
+            <w:vAlign w:val="center"/>
+            <w:tcMar>
+              <w:top w:w="50" w:type="dxa"/>
+              <w:start w:w="100" w:type="dxa"/>
+              <w:bottom w:w="50" w:type="dxa"/>
+              <w:end w:w="100" w:type="dxa"/>
+            </w:tcMar>
+          </w:tcPr>
+          <w:p>
+            <w:pPr>
+              <w:keepNext/>
+              <w:spacing w:after="0"/>
+              <w:jc w:val="center"/>
+            </w:pPr>
+            <w:r>
+              <w:rPr>
+                <w:rFonts w:ascii="Times New Roman" w:hAnsi="Times New Roman" w:eastAsia="Times New Roman"/>
+                <w:sz w:val="20"/>
+              </w:rPr>
+              <w:t>53</w:t>
+            </w:r>
+          </w:p>
+        </w:tc>
+        <w:tc>
+          <w:tcPr>
+            <w:tcW w:type="dxa" w:w="2456"/>
+            <w:vAlign w:val="center"/>
+            <w:tcMar>
+              <w:top w:w="50" w:type="dxa"/>
+              <w:start w:w="100" w:type="dxa"/>
+              <w:bottom w:w="50" w:type="dxa"/>
+              <w:end w:w="100" w:type="dxa"/>
+            </w:tcMar>
+          </w:tcPr>
+          <w:p>
+            <w:pPr>
+              <w:keepNext/>
+              <w:spacing w:after="0"/>
+              <w:jc w:val="center"/>
+            </w:pPr>
+            <w:r>
+              <w:rPr>
+                <w:rFonts w:ascii="Times New Roman" w:hAnsi="Times New Roman" w:eastAsia="Times New Roman"/>
+                <w:sz w:val="20"/>
+              </w:rPr>
+              <w:t>0,187%</w:t>
+            </w:r>
+          </w:p>
+        </w:tc>
+      </w:tr>
+      <w:tr>
+        <w:trPr>
+          <w:cantSplit w:val="true"/>
+        </w:trPr>
+        <w:tc>
+          <w:tcPr>
+            <w:tcW w:type="dxa" w:w="2300"/>
+            <w:shd w:fill="FFFFFF"/>
+            <w:vAlign w:val="center"/>
+            <w:tcMar>
+              <w:top w:w="50" w:type="dxa"/>
+              <w:start w:w="100" w:type="dxa"/>
+              <w:bottom w:w="50" w:type="dxa"/>
+              <w:end w:w="100" w:type="dxa"/>
+            </w:tcMar>
+          </w:tcPr>
+          <w:p>
+            <w:pPr>
+              <w:spacing w:after="0"/>
+              <w:jc w:val="left"/>
+            </w:pPr>
+            <w:r>
+              <w:rPr>
+                <w:rFonts w:ascii="Times New Roman" w:hAnsi="Times New Roman" w:eastAsia="Times New Roman"/>
+                <w:sz w:val="20"/>
+              </w:rPr>
+              <w:t>36–48+ giờ</w:t>
+            </w:r>
+          </w:p>
+        </w:tc>
+        <w:tc>
+          <w:tcPr>
+            <w:tcW w:type="dxa" w:w="2050"/>
+            <w:shd w:fill="FFFFFF"/>
+            <w:vAlign w:val="center"/>
+            <w:tcMar>
+              <w:top w:w="50" w:type="dxa"/>
+              <w:start w:w="100" w:type="dxa"/>
+              <w:bottom w:w="50" w:type="dxa"/>
+              <w:end w:w="100" w:type="dxa"/>
+            </w:tcMar>
+          </w:tcPr>
+          <w:p>
+            <w:pPr>
+              <w:spacing w:after="0"/>
+              <w:jc w:val="center"/>
+            </w:pPr>
+            <w:r>
+              <w:rPr>
+                <w:rFonts w:ascii="Times New Roman" w:hAnsi="Times New Roman" w:eastAsia="Times New Roman"/>
+                <w:sz w:val="20"/>
+              </w:rPr>
+              <w:t>55496</w:t>
+            </w:r>
+          </w:p>
+        </w:tc>
+        <w:tc>
+          <w:tcPr>
+            <w:tcW w:type="dxa" w:w="2050"/>
+            <w:shd w:fill="FFFFFF"/>
+            <w:vAlign w:val="center"/>
+            <w:tcMar>
+              <w:top w:w="50" w:type="dxa"/>
+              <w:start w:w="100" w:type="dxa"/>
+              <w:bottom w:w="50" w:type="dxa"/>
+              <w:end w:w="100" w:type="dxa"/>
+            </w:tcMar>
+          </w:tcPr>
+          <w:p>
+            <w:pPr>
+              <w:spacing w:after="0"/>
+              <w:jc w:val="center"/>
+            </w:pPr>
+            <w:r>
+              <w:rPr>
+                <w:rFonts w:ascii="Times New Roman" w:hAnsi="Times New Roman" w:eastAsia="Times New Roman"/>
+                <w:sz w:val="20"/>
+              </w:rPr>
+              <w:t>72</w:t>
+            </w:r>
+          </w:p>
+        </w:tc>
+        <w:tc>
+          <w:tcPr>
+            <w:tcW w:type="dxa" w:w="2456"/>
+            <w:shd w:fill="FFFFFF"/>
+            <w:vAlign w:val="center"/>
+            <w:tcMar>
+              <w:top w:w="50" w:type="dxa"/>
+              <w:start w:w="100" w:type="dxa"/>
+              <w:bottom w:w="50" w:type="dxa"/>
+              <w:end w:w="100" w:type="dxa"/>
+            </w:tcMar>
+          </w:tcPr>
+          <w:p>
+            <w:pPr>
+              <w:spacing w:after="0"/>
+              <w:jc w:val="center"/>
+            </w:pPr>
+            <w:r>
+              <w:rPr>
+                <w:rFonts w:ascii="Times New Roman" w:hAnsi="Times New Roman" w:eastAsia="Times New Roman"/>
+                <w:sz w:val="20"/>
+              </w:rPr>
+              <w:t>0,130%</w:t>
+            </w:r>
+          </w:p>
+        </w:tc>
+      </w:tr>
+    </w:tbl>
+    <w:p>
+      <w:pPr>
+        <w:spacing w:line="40" w:lineRule="exact" w:after="80"/>
+      </w:pPr>
+      <w:r>
+        <w:rPr>
+          <w:sz w:val="4"/>
+        </w:rPr>
+      </w:r>
+    </w:p>
+    <w:p>
+      <w:pPr>
+        <w:spacing w:line="300" w:lineRule="auto" w:after="80"/>
+        <w:ind w:firstLine="720"/>
+        <w:jc w:val="both"/>
+      </w:pPr>
+      <w:r>
+        <w:rPr>
+          <w:rFonts w:ascii="Times New Roman" w:hAnsi="Times New Roman" w:eastAsia="Times New Roman"/>
+          <w:i w:val="0"/>
+          <w:sz w:val="26"/>
+        </w:rPr>
+        <w:t>Bảng pivot đếm từng dòng train theo bốn cửa sổ Time và Class. Time là giây tương đối nên các cửa sổ này không mô tả giờ trong ngày hay xu hướng ở dữ liệu tương lai.</w:t>
+      </w:r>
+    </w:p>
+    <w:p>
+      <w:pPr>
+        <w:pStyle w:val="Caption"/>
+        <w:keepNext/>
+        <w:spacing w:before="100" w:after="60"/>
+        <w:jc w:val="center"/>
+      </w:pPr>
+      <w:r>
+        <w:rPr>
+          <w:rFonts w:ascii="Times New Roman" w:hAnsi="Times New Roman" w:eastAsia="Times New Roman"/>
+          <w:b/>
+          <w:color w:val="000000"/>
+          <w:sz w:val="21"/>
+        </w:rPr>
+        <w:t>Hình 3.5. Seaborn đa biến trên train</w:t>
+      </w:r>
+    </w:p>
+    <w:p>
+      <w:pPr>
+        <w:keepNext/>
+        <w:jc w:val="center"/>
+      </w:pPr>
+      <w:r>
+        <w:drawing>
+          <wp:inline xmlns:a="http://schemas.openxmlformats.org/drawingml/2006/main" xmlns:pic="http://schemas.openxmlformats.org/drawingml/2006/picture">
+            <wp:extent cx="5029200" cy="3325558"/>
+            <wp:docPr id="1149450721" name="Picture 1149450721" descr="Hình 3.5. Seaborn đa biến trên train"/>
+            <wp:cNvGraphicFramePr>
+              <a:graphicFrameLocks noChangeAspect="1"/>
+            </wp:cNvGraphicFramePr>
+            <a:graphic>
+              <a:graphicData uri="http://schemas.openxmlformats.org/drawingml/2006/picture">
+                <pic:pic>
+                  <pic:nvPicPr>
+                    <pic:cNvPr id="0" name="eda_seaborn_multivariate.png"/>
+                    <pic:cNvPicPr/>
+                  </pic:nvPicPr>
+                  <pic:blipFill>
+                    <a:blip r:embed="rId30"/>
+                    <a:stretch>
+                      <a:fillRect/>
+                    </a:stretch>
+                  </pic:blipFill>
+                  <pic:spPr>
+                    <a:xfrm>
+                      <a:off x="0" y="0"/>
+                      <a:ext cx="5029200" cy="3325558"/>
+                    </a:xfrm>
+                    <a:prstGeom prst="rect"/>
+                  </pic:spPr>
+                </pic:pic>
+              </a:graphicData>
+            </a:graphic>
+          </wp:inline>
+        </w:drawing>
+      </w:r>
+    </w:p>
+    <w:p>
+      <w:pPr>
+        <w:spacing w:line="300" w:lineRule="auto" w:after="140"/>
+        <w:jc w:val="both"/>
+      </w:pPr>
+      <w:r>
+        <w:rPr>
+          <w:rFonts w:ascii="Times New Roman" w:hAnsi="Times New Roman" w:eastAsia="Times New Roman"/>
+          <w:i/>
+          <w:sz w:val="26"/>
+        </w:rPr>
+        <w:t>Hai trục biểu diễn V14 và V17, màu chỉ Class, còn cỡ điểm biểu diễn LogAmount. Hình giữ toàn bộ 284 fraud và lấy mẫu 5.000 giao dịch hợp lệ để lớp hiếm nhìn rõ; tỷ lệ màu không đại diện cho prevalence, và hai lớp vẫn có vùng chồng lấp.</w:t>
       </w:r>
     </w:p>
     <w:p>
@@ -7960,7 +8669,7 @@
           <w:color w:val="000000"/>
           <w:sz w:val="21"/>
         </w:rPr>
-        <w:t>Bảng 3.3. So sánh validation và metric tại threshold tối đa F1</w:t>
+        <w:t>Bảng 3.4. So sánh validation và metric tại threshold tối đa F1</w:t>
       </w:r>
     </w:p>
     <w:tbl>
@@ -8899,7 +9608,7 @@
           <w:color w:val="000000"/>
           <w:sz w:val="21"/>
         </w:rPr>
-        <w:t>Hình 3.5. Precision Recall trên validation</w:t>
+        <w:t>Hình 3.6. Precision Recall trên validation</w:t>
       </w:r>
     </w:p>
     <w:p>
@@ -8911,7 +9620,7 @@
         <w:drawing>
           <wp:inline xmlns:a="http://schemas.openxmlformats.org/drawingml/2006/main" xmlns:pic="http://schemas.openxmlformats.org/drawingml/2006/picture">
             <wp:extent cx="5394960" cy="3932725"/>
-            <wp:docPr id="1149450721" name="Picture 1149450721" descr="Hình 3.5. Precision Recall trên validation"/>
+            <wp:docPr id="1149450722" name="Picture 1149450722" descr="Hình 3.6. Precision Recall trên validation"/>
             <wp:cNvGraphicFramePr>
               <a:graphicFrameLocks noChangeAspect="1"/>
             </wp:cNvGraphicFramePr>
@@ -8923,7 +9632,7 @@
                     <pic:cNvPicPr/>
                   </pic:nvPicPr>
                   <pic:blipFill>
-                    <a:blip r:embed="rId30"/>
+                    <a:blip r:embed="rId31"/>
                     <a:stretch>
                       <a:fillRect/>
                     </a:stretch>
@@ -8988,7 +9697,7 @@
           <w:color w:val="000000"/>
           <w:sz w:val="21"/>
         </w:rPr>
-        <w:t>Bảng 3.4a. Hiệu quả xếp hạng của model đã khóa trên test</w:t>
+        <w:t>Bảng 3.5a. Hiệu quả xếp hạng của model đã khóa trên test</w:t>
       </w:r>
     </w:p>
     <w:tbl>
@@ -9316,7 +10025,7 @@
           <w:color w:val="000000"/>
           <w:sz w:val="21"/>
         </w:rPr>
-        <w:t>Bảng 3.4b. Kết quả tại threshold đã khóa</w:t>
+        <w:t>Bảng 3.5b. Kết quả tại threshold đã khóa</w:t>
       </w:r>
     </w:p>
     <w:tbl>
@@ -9821,7 +10530,7 @@
           <w:color w:val="000000"/>
           <w:sz w:val="21"/>
         </w:rPr>
-        <w:t>Hình 3.6. Precision-Recall trên test đã khóa</w:t>
+        <w:t>Hình 3.7. Precision-Recall trên test đã khóa</w:t>
       </w:r>
     </w:p>
     <w:p>
@@ -9833,7 +10542,7 @@
         <w:drawing>
           <wp:inline xmlns:a="http://schemas.openxmlformats.org/drawingml/2006/main" xmlns:pic="http://schemas.openxmlformats.org/drawingml/2006/picture">
             <wp:extent cx="5394960" cy="3932725"/>
-            <wp:docPr id="1149450722" name="Picture 1149450722" descr="Hình 3.6. Precision-Recall trên test đã khóa"/>
+            <wp:docPr id="1149450723" name="Picture 1149450723" descr="Hình 3.7. Precision-Recall trên test đã khóa"/>
             <wp:cNvGraphicFramePr>
               <a:graphicFrameLocks noChangeAspect="1"/>
             </wp:cNvGraphicFramePr>
@@ -9845,7 +10554,7 @@
                     <pic:cNvPicPr/>
                   </pic:nvPicPr>
                   <pic:blipFill>
-                    <a:blip r:embed="rId31"/>
+                    <a:blip r:embed="rId32"/>
                     <a:stretch>
                       <a:fillRect/>
                     </a:stretch>
@@ -9875,7 +10584,7 @@
           <w:i/>
           <w:sz w:val="26"/>
         </w:rPr>
-        <w:t>AP được tính trực tiếp từ score liên tục bằng average_precision_score; test không được dùng để đổi model hoặc threshold.</w:t>
+        <w:t>AP được tính trực tiếp từ score liên tục bằng average_precision_score. Đường PR trên test chỉ dùng để mô tả kết quả sau khi khóa mô hình và ngưỡng trên validation.</w:t>
       </w:r>
     </w:p>
     <w:p>
@@ -9892,7 +10601,7 @@
           <w:color w:val="000000"/>
           <w:sz w:val="21"/>
         </w:rPr>
-        <w:t>Hình 3.7. Confusion matrix tại threshold đã khóa</w:t>
+        <w:t>Hình 3.8. Confusion matrix tại threshold đã khóa</w:t>
       </w:r>
     </w:p>
     <w:p>
@@ -9904,7 +10613,7 @@
         <w:drawing>
           <wp:inline xmlns:a="http://schemas.openxmlformats.org/drawingml/2006/main" xmlns:pic="http://schemas.openxmlformats.org/drawingml/2006/picture">
             <wp:extent cx="5394960" cy="4353487"/>
-            <wp:docPr id="1149450723" name="Picture 1149450723" descr="Hình 3.7. Confusion matrix tại threshold đã khóa"/>
+            <wp:docPr id="1149450724" name="Picture 1149450724" descr="Hình 3.8. Confusion matrix tại threshold đã khóa"/>
             <wp:cNvGraphicFramePr>
               <a:graphicFrameLocks noChangeAspect="1"/>
             </wp:cNvGraphicFramePr>
@@ -9916,7 +10625,7 @@
                     <pic:cNvPicPr/>
                   </pic:nvPicPr>
                   <pic:blipFill>
-                    <a:blip r:embed="rId32"/>
+                    <a:blip r:embed="rId33"/>
                     <a:stretch>
                       <a:fillRect/>
                     </a:stretch>
@@ -9980,7 +10689,7 @@
           <w:color w:val="000000"/>
           <w:sz w:val="21"/>
         </w:rPr>
-        <w:t>Bảng 3.5. Hiệu quả theo năng lực kiểm tra</w:t>
+        <w:t>Bảng 3.6. Hiệu quả theo năng lực kiểm tra</w:t>
       </w:r>
     </w:p>
     <w:tbl>
@@ -10812,7 +11521,7 @@
           <w:color w:val="000000"/>
           <w:sz w:val="21"/>
         </w:rPr>
-        <w:t>Hình 3.8. Recall và Lift theo Top-p</w:t>
+        <w:t>Hình 3.9. Recall và Lift theo Top-p</w:t>
       </w:r>
     </w:p>
     <w:p>
@@ -10824,7 +11533,7 @@
         <w:drawing>
           <wp:inline xmlns:a="http://schemas.openxmlformats.org/drawingml/2006/main" xmlns:pic="http://schemas.openxmlformats.org/drawingml/2006/picture">
             <wp:extent cx="5394960" cy="2409724"/>
-            <wp:docPr id="1149450724" name="Picture 1149450724" descr="Hình 3.8. Recall và Lift theo Top-p"/>
+            <wp:docPr id="1149450725" name="Picture 1149450725" descr="Hình 3.9. Recall và Lift theo Top-p"/>
             <wp:cNvGraphicFramePr>
               <a:graphicFrameLocks noChangeAspect="1"/>
             </wp:cNvGraphicFramePr>
@@ -10836,7 +11545,7 @@
                     <pic:cNvPicPr/>
                   </pic:nvPicPr>
                   <pic:blipFill>
-                    <a:blip r:embed="rId33"/>
+                    <a:blip r:embed="rId34"/>
                     <a:stretch>
                       <a:fillRect/>
                     </a:stretch>
@@ -10866,7 +11575,7 @@
           <w:i/>
           <w:sz w:val="26"/>
         </w:rPr>
-        <w:t>Recall tăng chậm khi mở rộng p, trong khi Lift giảm mạnh vì danh sách chứa nhiều giao dịch hợp lệ hơn.</w:t>
+        <w:t>Recall tăng khi mở rộng p, trong khi Lift giảm vì danh sách chứa thêm giao dịch hợp lệ. Chọn p theo năng lực kiểm tra; không thể coi cùng một p là tối ưu cho mọi chi phí vận hành.</w:t>
       </w:r>
     </w:p>
     <w:p>
@@ -10900,7 +11609,7 @@
           <w:color w:val="000000"/>
           <w:sz w:val="21"/>
         </w:rPr>
-        <w:t>Bảng 3.6. Mẫu lỗi được kiểm tra</w:t>
+        <w:t>Bảng 3.7. Mẫu lỗi được kiểm tra</w:t>
       </w:r>
     </w:p>
     <w:tbl>
@@ -11302,7 +12011,7 @@
           <w:color w:val="000000"/>
           <w:sz w:val="21"/>
         </w:rPr>
-        <w:t>Hình 3.9. Feature importance của Random Forest</w:t>
+        <w:t>Hình 3.10. Feature importance của Random Forest</w:t>
       </w:r>
     </w:p>
     <w:p>
@@ -11314,7 +12023,7 @@
         <w:drawing>
           <wp:inline xmlns:a="http://schemas.openxmlformats.org/drawingml/2006/main" xmlns:pic="http://schemas.openxmlformats.org/drawingml/2006/picture">
             <wp:extent cx="5394960" cy="4242425"/>
-            <wp:docPr id="1149450725" name="Picture 1149450725" descr="Hình 3.9. Feature importance của Random Forest"/>
+            <wp:docPr id="1149450726" name="Picture 1149450726" descr="Hình 3.10. Feature importance của Random Forest"/>
             <wp:cNvGraphicFramePr>
               <a:graphicFrameLocks noChangeAspect="1"/>
             </wp:cNvGraphicFramePr>
@@ -11326,7 +12035,7 @@
                     <pic:cNvPicPr/>
                   </pic:nvPicPr>
                   <pic:blipFill>
-                    <a:blip r:embed="rId34"/>
+                    <a:blip r:embed="rId35"/>
                     <a:stretch>
                       <a:fillRect/>
                     </a:stretch>
@@ -12146,7 +12855,7 @@
           <w:rFonts w:ascii="Times New Roman" w:hAnsi="Times New Roman" w:eastAsia="Times New Roman"/>
           <w:sz w:val="26"/>
         </w:rPr>
-        <w:t>EDA chỉ trên train và xuất bốn hình.</w:t>
+        <w:t>EDA chỉ trên train, pivot_table và năm hình gồm Seaborn đa biến.</w:t>
       </w:r>
     </w:p>
     <w:p>
@@ -13027,6 +13736,21 @@
           <w:sz w:val="26"/>
         </w:rPr>
         <w:t>[13] Nguyễn Mạnh Hùng, Python for Data Science, Buổi 1, ngày 17/08/2026, slide 26–30. Tài liệu học phần Cơ sở Khoa học Dữ liệu.</w:t>
+      </w:r>
+    </w:p>
+    <w:p>
+      <w:pPr>
+        <w:spacing w:line="240" w:lineRule="auto" w:after="80"/>
+        <w:ind w:left="360" w:hanging="360"/>
+        <w:jc w:val="left"/>
+      </w:pPr>
+      <w:r>
+        <w:rPr>
+          <w:rFonts w:ascii="Times New Roman" w:hAnsi="Times New Roman" w:eastAsia="Times New Roman"/>
+          <w:i w:val="0"/>
+          <w:sz w:val="26"/>
+        </w:rPr>
+        <w:t>[14] Nguyễn Mạnh Hùng, Python for Data Science, Buổi 9, ngày 19/08/2026, slide 77–78. Yêu cầu và cấu trúc đồ án giữa kỳ.</w:t>
       </w:r>
     </w:p>
     <w:sectPr>

</xml_diff>

<commit_message>
Reproduce post-lock FP/FN Seaborn chart and verify report evidence
</commit_message>
<xml_diff>
--- a/ECCC-LITE-FINAL/reports/BaoCao_NOP.docx
+++ b/ECCC-LITE-FINAL/reports/BaoCao_NOP.docx
@@ -2035,8 +2035,8 @@
           <w:szCs w:val="26"/>
         </w:rPr>
         <w:sectPr>
-          <w:headerReference w:type="default" r:id="rId36"/>
-          <w:footerReference w:type="default" r:id="rId37"/>
+          <w:headerReference w:type="default" r:id="rId37"/>
+          <w:footerReference w:type="default" r:id="rId38"/>
           <w:pgSz w:w="11906" w:h="16838"/>
           <w:pgMar w:top="1418" w:right="1134" w:bottom="851" w:left="1701" w:header="454" w:footer="340" w:gutter="0"/>
           <w:cols w:space="720"/>
@@ -11984,6 +11984,77 @@
     </w:p>
     <w:p>
       <w:pPr>
+        <w:pStyle w:val="Caption"/>
+        <w:keepNext/>
+        <w:spacing w:before="100" w:after="60"/>
+        <w:jc w:val="center"/>
+      </w:pPr>
+      <w:r>
+        <w:rPr>
+          <w:rFonts w:ascii="Times New Roman" w:hAnsi="Times New Roman" w:eastAsia="Times New Roman"/>
+          <w:b/>
+          <w:color w:val="000000"/>
+          <w:sz w:val="21"/>
+        </w:rPr>
+        <w:t>Hình 3.10. Seaborn đa biến trên mẫu FP/FN của test đã khóa</w:t>
+      </w:r>
+    </w:p>
+    <w:p>
+      <w:pPr>
+        <w:keepNext/>
+        <w:jc w:val="center"/>
+      </w:pPr>
+      <w:r>
+        <w:drawing>
+          <wp:inline xmlns:a="http://schemas.openxmlformats.org/drawingml/2006/main" xmlns:pic="http://schemas.openxmlformats.org/drawingml/2006/picture">
+            <wp:extent cx="5029200" cy="2689559"/>
+            <wp:docPr id="1149450726" name="Picture 1149450726" descr="Hình 3.10. Seaborn đa biến trên mẫu FP/FN của test đã khóa"/>
+            <wp:cNvGraphicFramePr>
+              <a:graphicFrameLocks noChangeAspect="1"/>
+            </wp:cNvGraphicFramePr>
+            <a:graphic>
+              <a:graphicData uri="http://schemas.openxmlformats.org/drawingml/2006/picture">
+                <pic:pic>
+                  <pic:nvPicPr>
+                    <pic:cNvPr id="0" name="seaborn_error_cases_multivariate.png"/>
+                    <pic:cNvPicPr/>
+                  </pic:nvPicPr>
+                  <pic:blipFill>
+                    <a:blip r:embed="rId35"/>
+                    <a:stretch>
+                      <a:fillRect/>
+                    </a:stretch>
+                  </pic:blipFill>
+                  <pic:spPr>
+                    <a:xfrm>
+                      <a:off x="0" y="0"/>
+                      <a:ext cx="5029200" cy="2689559"/>
+                    </a:xfrm>
+                    <a:prstGeom prst="rect"/>
+                  </pic:spPr>
+                </pic:pic>
+              </a:graphicData>
+            </a:graphic>
+          </wp:inline>
+        </w:drawing>
+      </w:r>
+    </w:p>
+    <w:p>
+      <w:pPr>
+        <w:spacing w:line="300" w:lineRule="auto" w:after="140"/>
+        <w:jc w:val="both"/>
+      </w:pPr>
+      <w:r>
+        <w:rPr>
+          <w:rFonts w:ascii="Times New Roman" w:hAnsi="Times New Roman" w:eastAsia="Times New Roman"/>
+          <w:i/>
+          <w:sz w:val="26"/>
+        </w:rPr>
+        <w:t>Mười cảnh báo nhầm và mười giao dịch bị bỏ sót được mô tả theo LogAmount, V14, loại lỗi và score. Đây là 20 trường hợp được chọn sau khi đánh giá test, không đại diện toàn bộ phân bố test và không dùng để thay đổi mô hình hoặc threshold.</w:t>
+      </w:r>
+    </w:p>
+    <w:p>
+      <w:pPr>
         <w:spacing w:line="300" w:lineRule="auto" w:after="80"/>
         <w:ind w:firstLine="720"/>
         <w:jc w:val="both"/>
@@ -12011,7 +12082,7 @@
           <w:color w:val="000000"/>
           <w:sz w:val="21"/>
         </w:rPr>
-        <w:t>Hình 3.10. Feature importance của Random Forest</w:t>
+        <w:t>Hình 3.11. Feature importance của Random Forest</w:t>
       </w:r>
     </w:p>
     <w:p>
@@ -12023,7 +12094,7 @@
         <w:drawing>
           <wp:inline xmlns:a="http://schemas.openxmlformats.org/drawingml/2006/main" xmlns:pic="http://schemas.openxmlformats.org/drawingml/2006/picture">
             <wp:extent cx="5394960" cy="4242425"/>
-            <wp:docPr id="1149450726" name="Picture 1149450726" descr="Hình 3.10. Feature importance của Random Forest"/>
+            <wp:docPr id="1149450727" name="Picture 1149450727" descr="Hình 3.11. Feature importance của Random Forest"/>
             <wp:cNvGraphicFramePr>
               <a:graphicFrameLocks noChangeAspect="1"/>
             </wp:cNvGraphicFramePr>
@@ -12035,7 +12106,7 @@
                     <pic:cNvPicPr/>
                   </pic:nvPicPr>
                   <pic:blipFill>
-                    <a:blip r:embed="rId35"/>
+                    <a:blip r:embed="rId36"/>
                     <a:stretch>
                       <a:fillRect/>
                     </a:stretch>

</xml_diff>

<commit_message>
Meet Buổi 9 EDA rubric and reproduce Seaborn figures in ECCC-LITE
</commit_message>
<xml_diff>
--- a/ECCC-LITE-FINAL/reports/BaoCao_NOP.docx
+++ b/ECCC-LITE-FINAL/reports/BaoCao_NOP.docx
@@ -1802,7 +1802,7 @@
         </w:rPr>
         <w:t>3.4. Kết quả test cuối</w:t>
         <w:tab/>
-        <w:t>11</w:t>
+        <w:t>12</w:t>
       </w:r>
     </w:p>
     <w:p>
@@ -1822,7 +1822,7 @@
         </w:rPr>
         <w:t>3.5. Kết quả Top-p</w:t>
         <w:tab/>
-        <w:t>12</w:t>
+        <w:t>13</w:t>
       </w:r>
     </w:p>
     <w:p>
@@ -1842,7 +1842,7 @@
         </w:rPr>
         <w:t>3.6. Phân tích False Positive, False Negative và feature importance</w:t>
         <w:tab/>
-        <w:t>13</w:t>
+        <w:t>14</w:t>
       </w:r>
     </w:p>
     <w:p>
@@ -1862,7 +1862,7 @@
         </w:rPr>
         <w:t>3.7. Thảo luận kết quả và giới hạn</w:t>
         <w:tab/>
-        <w:t>14</w:t>
+        <w:t>15</w:t>
       </w:r>
     </w:p>
     <w:p>
@@ -1882,7 +1882,7 @@
         </w:rPr>
         <w:t>PHẦN KẾT LUẬN</w:t>
         <w:tab/>
-        <w:t>15</w:t>
+        <w:t>16</w:t>
       </w:r>
     </w:p>
     <w:p>
@@ -1902,7 +1902,7 @@
         </w:rPr>
         <w:t>PHỤ LỤC A: TỔ CHỨC REPOSITORY VÀ NOTEBOOK</w:t>
         <w:tab/>
-        <w:t>16</w:t>
+        <w:t>17</w:t>
       </w:r>
     </w:p>
     <w:p>
@@ -1922,7 +1922,7 @@
         </w:rPr>
         <w:t>A.1. 01_data_eda.ipynb - Hoan</w:t>
         <w:tab/>
-        <w:t>16</w:t>
+        <w:t>17</w:t>
       </w:r>
     </w:p>
     <w:p>
@@ -1942,7 +1942,7 @@
         </w:rPr>
         <w:t>A.2. 02_modeling.ipynb - Huy</w:t>
         <w:tab/>
-        <w:t>16</w:t>
+        <w:t>17</w:t>
       </w:r>
     </w:p>
     <w:p>
@@ -1962,7 +1962,7 @@
         </w:rPr>
         <w:t>A.3. 03_evaluation.ipynb - Sang</w:t>
         <w:tab/>
-        <w:t>16</w:t>
+        <w:t>17</w:t>
       </w:r>
     </w:p>
     <w:p>
@@ -1982,7 +1982,7 @@
         </w:rPr>
         <w:t>A.4. Fraud_Project_Final.ipynb - cả nhóm</w:t>
         <w:tab/>
-        <w:t>16</w:t>
+        <w:t>17</w:t>
       </w:r>
     </w:p>
     <w:p>
@@ -2002,7 +2002,7 @@
         </w:rPr>
         <w:t>PHỤ LỤC B: PHÂN CÔNG VÀ TRẠNG THÁI HOÀN THÀNH</w:t>
         <w:tab/>
-        <w:t>17</w:t>
+        <w:t>18</w:t>
       </w:r>
     </w:p>
     <w:p>
@@ -2022,7 +2022,7 @@
         </w:rPr>
         <w:t>TÀI LIỆU THAM KHẢO</w:t>
         <w:tab/>
-        <w:t>18</w:t>
+        <w:t>19</w:t>
       </w:r>
       <w:r>
         <w:fldChar w:fldCharType="end"/>
@@ -2035,8 +2035,8 @@
           <w:szCs w:val="26"/>
         </w:rPr>
         <w:sectPr>
-          <w:headerReference w:type="default" r:id="rId35"/>
-          <w:footerReference w:type="default" r:id="rId36"/>
+          <w:headerReference w:type="default" r:id="rId37"/>
+          <w:footerReference w:type="default" r:id="rId38"/>
           <w:pgSz w:w="11906" w:h="16838"/>
           <w:pgMar w:top="1418" w:right="1134" w:bottom="851" w:left="1701" w:header="454" w:footer="340" w:gutter="0"/>
           <w:cols w:space="720"/>
@@ -5566,6 +5566,20 @@
     </w:p>
     <w:p>
       <w:pPr>
+        <w:pStyle w:val="ListBullet"/>
+        <w:spacing w:after="40"/>
+        <w:jc w:val="both"/>
+      </w:pPr>
+      <w:r>
+        <w:rPr>
+          <w:rFonts w:ascii="Times New Roman" w:hAnsi="Times New Roman" w:eastAsia="Times New Roman"/>
+          <w:sz w:val="26"/>
+        </w:rPr>
+        <w:t>Pivot Time × Class và biểu đồ Seaborn đa biến V14, V17, Class, LogAmount chỉ trên train [14].</w:t>
+      </w:r>
+    </w:p>
+    <w:p>
+      <w:pPr>
         <w:pStyle w:val="Heading2"/>
         <w:keepNext/>
       </w:pPr>
@@ -7670,7 +7684,7 @@
       <w:r>
         <w:drawing>
           <wp:inline xmlns:a="http://schemas.openxmlformats.org/drawingml/2006/main" xmlns:pic="http://schemas.openxmlformats.org/drawingml/2006/picture">
-            <wp:extent cx="5394960" cy="3437112"/>
+            <wp:extent cx="5394960" cy="3425647"/>
             <wp:docPr id="1149450717" name="Picture 1149450717" descr="Hình 3.1. Phân bố Class trên train"/>
             <wp:cNvGraphicFramePr>
               <a:graphicFrameLocks noChangeAspect="1"/>
@@ -7691,7 +7705,7 @@
                   <pic:spPr>
                     <a:xfrm>
                       <a:off x="0" y="0"/>
-                      <a:ext cx="5394960" cy="3437112"/>
+                      <a:ext cx="5394960" cy="3425647"/>
                     </a:xfrm>
                     <a:prstGeom prst="rect"/>
                   </pic:spPr>
@@ -7713,7 +7727,7 @@
           <w:i/>
           <w:sz w:val="26"/>
         </w:rPr>
-        <w:t>Train chỉ có 284 fraud trên 170.235 giao dịch (0,167%), xác nhận Accuracy đơn lẻ không phù hợp để chọn mô hình.</w:t>
+        <w:t>Train chỉ có 284 fraud trên 170.235 giao dịch (0,167%). Accuracy đơn lẻ không phù hợp để chọn mô hình vì dự đoán toàn bộ là hợp lệ vẫn cho giá trị cao mà bỏ sót mọi fraud.</w:t>
       </w:r>
     </w:p>
     <w:p>
@@ -7741,7 +7755,7 @@
       <w:r>
         <w:drawing>
           <wp:inline xmlns:a="http://schemas.openxmlformats.org/drawingml/2006/main" xmlns:pic="http://schemas.openxmlformats.org/drawingml/2006/picture">
-            <wp:extent cx="5394960" cy="1986555"/>
+            <wp:extent cx="5394960" cy="1983107"/>
             <wp:docPr id="1149450718" name="Picture 1149450718" descr="Hình 3.2. Amount/LogAmount theo Class"/>
             <wp:cNvGraphicFramePr>
               <a:graphicFrameLocks noChangeAspect="1"/>
@@ -7762,7 +7776,7 @@
                   <pic:spPr>
                     <a:xfrm>
                       <a:off x="0" y="0"/>
-                      <a:ext cx="5394960" cy="1986555"/>
+                      <a:ext cx="5394960" cy="1983107"/>
                     </a:xfrm>
                     <a:prstGeom prst="rect"/>
                   </pic:spPr>
@@ -7812,7 +7826,7 @@
       <w:r>
         <w:drawing>
           <wp:inline xmlns:a="http://schemas.openxmlformats.org/drawingml/2006/main" xmlns:pic="http://schemas.openxmlformats.org/drawingml/2006/picture">
-            <wp:extent cx="5394960" cy="2658679"/>
+            <wp:extent cx="5394960" cy="2657018"/>
             <wp:docPr id="1149450719" name="Picture 1149450719" descr="Hình 3.3. Time theo Class"/>
             <wp:cNvGraphicFramePr>
               <a:graphicFrameLocks noChangeAspect="1"/>
@@ -7833,7 +7847,7 @@
                   <pic:spPr>
                     <a:xfrm>
                       <a:off x="0" y="0"/>
-                      <a:ext cx="5394960" cy="2658679"/>
+                      <a:ext cx="5394960" cy="2657018"/>
                     </a:xfrm>
                     <a:prstGeom prst="rect"/>
                   </pic:spPr>
@@ -7883,7 +7897,7 @@
       <w:r>
         <w:drawing>
           <wp:inline xmlns:a="http://schemas.openxmlformats.org/drawingml/2006/main" xmlns:pic="http://schemas.openxmlformats.org/drawingml/2006/picture">
-            <wp:extent cx="5394960" cy="3675103"/>
+            <wp:extent cx="5394960" cy="3671306"/>
             <wp:docPr id="1149450720" name="Picture 1149450720" descr="Hình 3.4. Tương quan chọn lọc trên train"/>
             <wp:cNvGraphicFramePr>
               <a:graphicFrameLocks noChangeAspect="1"/>
@@ -7904,7 +7918,7 @@
                   <pic:spPr>
                     <a:xfrm>
                       <a:off x="0" y="0"/>
-                      <a:ext cx="5394960" cy="3675103"/>
+                      <a:ext cx="5394960" cy="3671306"/>
                     </a:xfrm>
                     <a:prstGeom prst="rect"/>
                   </pic:spPr>
@@ -7927,6 +7941,701 @@
           <w:sz w:val="26"/>
         </w:rPr>
         <w:t>V17 có |tương quan Pearson| lớn nhất trong bảng chọn lọc (-0,3197). Đây chỉ là liên hệ thống kê trên train; V1-V28 không được gán ý nghĩa nghiệp vụ.</w:t>
+      </w:r>
+    </w:p>
+    <w:p>
+      <w:pPr>
+        <w:pStyle w:val="Caption"/>
+        <w:keepNext/>
+        <w:spacing w:before="100" w:after="60"/>
+        <w:jc w:val="center"/>
+      </w:pPr>
+      <w:r>
+        <w:rPr>
+          <w:rFonts w:ascii="Times New Roman" w:hAnsi="Times New Roman" w:eastAsia="Times New Roman"/>
+          <w:b/>
+          <w:color w:val="000000"/>
+          <w:sz w:val="21"/>
+        </w:rPr>
+        <w:t>Bảng 3.3. Pivot Time theo Class từ từng giao dịch train</w:t>
+      </w:r>
+    </w:p>
+    <w:tbl>
+      <w:tblPr>
+        <w:tblStyle w:val="TableGrid"/>
+        <w:tblW w:type="dxa" w:w="8856"/>
+        <w:jc w:val="left"/>
+        <w:tblLayout w:type="fixed"/>
+        <w:tblLook w:firstColumn="1" w:firstRow="1" w:lastColumn="0" w:lastRow="0" w:noHBand="0" w:noVBand="1" w:val="04A0"/>
+        <w:tblBorders>
+          <w:top w:val="single" w:sz="6" w:color="D9D9D9"/>
+          <w:left w:val="single" w:sz="6" w:color="D9D9D9"/>
+          <w:bottom w:val="single" w:sz="6" w:color="D9D9D9"/>
+          <w:right w:val="single" w:sz="6" w:color="D9D9D9"/>
+          <w:insideH w:val="single" w:sz="6" w:color="D9D9D9"/>
+          <w:insideV w:val="single" w:sz="6" w:color="D9D9D9"/>
+        </w:tblBorders>
+        <w:tblInd w:w="120" w:type="dxa"/>
+      </w:tblPr>
+      <w:tblGrid>
+        <w:gridCol w:w="2300"/>
+        <w:gridCol w:w="2050"/>
+        <w:gridCol w:w="2050"/>
+        <w:gridCol w:w="2456"/>
+      </w:tblGrid>
+      <w:tr>
+        <w:trPr>
+          <w:tblHeader w:val="true"/>
+          <w:cantSplit w:val="true"/>
+        </w:trPr>
+        <w:tc>
+          <w:tcPr>
+            <w:tcW w:type="dxa" w:w="2300"/>
+            <w:shd w:fill="FFFFFF"/>
+            <w:vAlign w:val="center"/>
+            <w:tcMar>
+              <w:top w:w="50" w:type="dxa"/>
+              <w:start w:w="100" w:type="dxa"/>
+              <w:bottom w:w="50" w:type="dxa"/>
+              <w:end w:w="100" w:type="dxa"/>
+            </w:tcMar>
+          </w:tcPr>
+          <w:p>
+            <w:pPr>
+              <w:keepNext/>
+              <w:spacing w:after="0"/>
+              <w:jc w:val="center"/>
+            </w:pPr>
+            <w:r>
+              <w:rPr>
+                <w:rFonts w:ascii="Times New Roman" w:hAnsi="Times New Roman" w:eastAsia="Times New Roman"/>
+                <w:b/>
+                <w:sz w:val="20"/>
+              </w:rPr>
+              <w:t>Time tương đối</w:t>
+            </w:r>
+          </w:p>
+        </w:tc>
+        <w:tc>
+          <w:tcPr>
+            <w:tcW w:type="dxa" w:w="2050"/>
+            <w:shd w:fill="FFFFFF"/>
+            <w:vAlign w:val="center"/>
+            <w:tcMar>
+              <w:top w:w="50" w:type="dxa"/>
+              <w:start w:w="100" w:type="dxa"/>
+              <w:bottom w:w="50" w:type="dxa"/>
+              <w:end w:w="100" w:type="dxa"/>
+            </w:tcMar>
+          </w:tcPr>
+          <w:p>
+            <w:pPr>
+              <w:keepNext/>
+              <w:spacing w:after="0"/>
+              <w:jc w:val="center"/>
+            </w:pPr>
+            <w:r>
+              <w:rPr>
+                <w:rFonts w:ascii="Times New Roman" w:hAnsi="Times New Roman" w:eastAsia="Times New Roman"/>
+                <w:b/>
+                <w:sz w:val="20"/>
+              </w:rPr>
+              <w:t>Class 0</w:t>
+            </w:r>
+          </w:p>
+        </w:tc>
+        <w:tc>
+          <w:tcPr>
+            <w:tcW w:type="dxa" w:w="2050"/>
+            <w:shd w:fill="FFFFFF"/>
+            <w:vAlign w:val="center"/>
+            <w:tcMar>
+              <w:top w:w="50" w:type="dxa"/>
+              <w:start w:w="100" w:type="dxa"/>
+              <w:bottom w:w="50" w:type="dxa"/>
+              <w:end w:w="100" w:type="dxa"/>
+            </w:tcMar>
+          </w:tcPr>
+          <w:p>
+            <w:pPr>
+              <w:keepNext/>
+              <w:spacing w:after="0"/>
+              <w:jc w:val="center"/>
+            </w:pPr>
+            <w:r>
+              <w:rPr>
+                <w:rFonts w:ascii="Times New Roman" w:hAnsi="Times New Roman" w:eastAsia="Times New Roman"/>
+                <w:b/>
+                <w:sz w:val="20"/>
+              </w:rPr>
+              <w:t>Class 1</w:t>
+            </w:r>
+          </w:p>
+        </w:tc>
+        <w:tc>
+          <w:tcPr>
+            <w:tcW w:type="dxa" w:w="2456"/>
+            <w:shd w:fill="FFFFFF"/>
+            <w:vAlign w:val="center"/>
+            <w:tcMar>
+              <w:top w:w="50" w:type="dxa"/>
+              <w:start w:w="100" w:type="dxa"/>
+              <w:bottom w:w="50" w:type="dxa"/>
+              <w:end w:w="100" w:type="dxa"/>
+            </w:tcMar>
+          </w:tcPr>
+          <w:p>
+            <w:pPr>
+              <w:keepNext/>
+              <w:spacing w:after="0"/>
+              <w:jc w:val="center"/>
+            </w:pPr>
+            <w:r>
+              <w:rPr>
+                <w:rFonts w:ascii="Times New Roman" w:hAnsi="Times New Roman" w:eastAsia="Times New Roman"/>
+                <w:b/>
+                <w:sz w:val="20"/>
+              </w:rPr>
+              <w:t>Tỷ lệ fraud</w:t>
+            </w:r>
+          </w:p>
+        </w:tc>
+      </w:tr>
+      <w:tr>
+        <w:trPr>
+          <w:cantSplit w:val="true"/>
+        </w:trPr>
+        <w:tc>
+          <w:tcPr>
+            <w:tcW w:type="dxa" w:w="2300"/>
+            <w:vAlign w:val="center"/>
+            <w:tcMar>
+              <w:top w:w="50" w:type="dxa"/>
+              <w:start w:w="100" w:type="dxa"/>
+              <w:bottom w:w="50" w:type="dxa"/>
+              <w:end w:w="100" w:type="dxa"/>
+            </w:tcMar>
+          </w:tcPr>
+          <w:p>
+            <w:pPr>
+              <w:keepNext/>
+              <w:spacing w:after="0"/>
+              <w:jc w:val="left"/>
+            </w:pPr>
+            <w:r>
+              <w:rPr>
+                <w:rFonts w:ascii="Times New Roman" w:hAnsi="Times New Roman" w:eastAsia="Times New Roman"/>
+                <w:sz w:val="20"/>
+              </w:rPr>
+              <w:t>0–12 giờ</w:t>
+            </w:r>
+          </w:p>
+        </w:tc>
+        <w:tc>
+          <w:tcPr>
+            <w:tcW w:type="dxa" w:w="2050"/>
+            <w:vAlign w:val="center"/>
+            <w:tcMar>
+              <w:top w:w="50" w:type="dxa"/>
+              <w:start w:w="100" w:type="dxa"/>
+              <w:bottom w:w="50" w:type="dxa"/>
+              <w:end w:w="100" w:type="dxa"/>
+            </w:tcMar>
+          </w:tcPr>
+          <w:p>
+            <w:pPr>
+              <w:keepNext/>
+              <w:spacing w:after="0"/>
+              <w:jc w:val="center"/>
+            </w:pPr>
+            <w:r>
+              <w:rPr>
+                <w:rFonts w:ascii="Times New Roman" w:hAnsi="Times New Roman" w:eastAsia="Times New Roman"/>
+                <w:sz w:val="20"/>
+              </w:rPr>
+              <w:t>28257</w:t>
+            </w:r>
+          </w:p>
+        </w:tc>
+        <w:tc>
+          <w:tcPr>
+            <w:tcW w:type="dxa" w:w="2050"/>
+            <w:vAlign w:val="center"/>
+            <w:tcMar>
+              <w:top w:w="50" w:type="dxa"/>
+              <w:start w:w="100" w:type="dxa"/>
+              <w:bottom w:w="50" w:type="dxa"/>
+              <w:end w:w="100" w:type="dxa"/>
+            </w:tcMar>
+          </w:tcPr>
+          <w:p>
+            <w:pPr>
+              <w:keepNext/>
+              <w:spacing w:after="0"/>
+              <w:jc w:val="center"/>
+            </w:pPr>
+            <w:r>
+              <w:rPr>
+                <w:rFonts w:ascii="Times New Roman" w:hAnsi="Times New Roman" w:eastAsia="Times New Roman"/>
+                <w:sz w:val="20"/>
+              </w:rPr>
+              <w:t>91</w:t>
+            </w:r>
+          </w:p>
+        </w:tc>
+        <w:tc>
+          <w:tcPr>
+            <w:tcW w:type="dxa" w:w="2456"/>
+            <w:vAlign w:val="center"/>
+            <w:tcMar>
+              <w:top w:w="50" w:type="dxa"/>
+              <w:start w:w="100" w:type="dxa"/>
+              <w:bottom w:w="50" w:type="dxa"/>
+              <w:end w:w="100" w:type="dxa"/>
+            </w:tcMar>
+          </w:tcPr>
+          <w:p>
+            <w:pPr>
+              <w:keepNext/>
+              <w:spacing w:after="0"/>
+              <w:jc w:val="center"/>
+            </w:pPr>
+            <w:r>
+              <w:rPr>
+                <w:rFonts w:ascii="Times New Roman" w:hAnsi="Times New Roman" w:eastAsia="Times New Roman"/>
+                <w:sz w:val="20"/>
+              </w:rPr>
+              <w:t>0,321%</w:t>
+            </w:r>
+          </w:p>
+        </w:tc>
+      </w:tr>
+      <w:tr>
+        <w:trPr>
+          <w:cantSplit w:val="true"/>
+        </w:trPr>
+        <w:tc>
+          <w:tcPr>
+            <w:tcW w:type="dxa" w:w="2300"/>
+            <w:shd w:fill="FFFFFF"/>
+            <w:vAlign w:val="center"/>
+            <w:tcMar>
+              <w:top w:w="50" w:type="dxa"/>
+              <w:start w:w="100" w:type="dxa"/>
+              <w:bottom w:w="50" w:type="dxa"/>
+              <w:end w:w="100" w:type="dxa"/>
+            </w:tcMar>
+          </w:tcPr>
+          <w:p>
+            <w:pPr>
+              <w:keepNext/>
+              <w:spacing w:after="0"/>
+              <w:jc w:val="left"/>
+            </w:pPr>
+            <w:r>
+              <w:rPr>
+                <w:rFonts w:ascii="Times New Roman" w:hAnsi="Times New Roman" w:eastAsia="Times New Roman"/>
+                <w:sz w:val="20"/>
+              </w:rPr>
+              <w:t>12–24 giờ</w:t>
+            </w:r>
+          </w:p>
+        </w:tc>
+        <w:tc>
+          <w:tcPr>
+            <w:tcW w:type="dxa" w:w="2050"/>
+            <w:shd w:fill="FFFFFF"/>
+            <w:vAlign w:val="center"/>
+            <w:tcMar>
+              <w:top w:w="50" w:type="dxa"/>
+              <w:start w:w="100" w:type="dxa"/>
+              <w:bottom w:w="50" w:type="dxa"/>
+              <w:end w:w="100" w:type="dxa"/>
+            </w:tcMar>
+          </w:tcPr>
+          <w:p>
+            <w:pPr>
+              <w:keepNext/>
+              <w:spacing w:after="0"/>
+              <w:jc w:val="center"/>
+            </w:pPr>
+            <w:r>
+              <w:rPr>
+                <w:rFonts w:ascii="Times New Roman" w:hAnsi="Times New Roman" w:eastAsia="Times New Roman"/>
+                <w:sz w:val="20"/>
+              </w:rPr>
+              <w:t>57895</w:t>
+            </w:r>
+          </w:p>
+        </w:tc>
+        <w:tc>
+          <w:tcPr>
+            <w:tcW w:type="dxa" w:w="2050"/>
+            <w:shd w:fill="FFFFFF"/>
+            <w:vAlign w:val="center"/>
+            <w:tcMar>
+              <w:top w:w="50" w:type="dxa"/>
+              <w:start w:w="100" w:type="dxa"/>
+              <w:bottom w:w="50" w:type="dxa"/>
+              <w:end w:w="100" w:type="dxa"/>
+            </w:tcMar>
+          </w:tcPr>
+          <w:p>
+            <w:pPr>
+              <w:keepNext/>
+              <w:spacing w:after="0"/>
+              <w:jc w:val="center"/>
+            </w:pPr>
+            <w:r>
+              <w:rPr>
+                <w:rFonts w:ascii="Times New Roman" w:hAnsi="Times New Roman" w:eastAsia="Times New Roman"/>
+                <w:sz w:val="20"/>
+              </w:rPr>
+              <w:t>68</w:t>
+            </w:r>
+          </w:p>
+        </w:tc>
+        <w:tc>
+          <w:tcPr>
+            <w:tcW w:type="dxa" w:w="2456"/>
+            <w:shd w:fill="FFFFFF"/>
+            <w:vAlign w:val="center"/>
+            <w:tcMar>
+              <w:top w:w="50" w:type="dxa"/>
+              <w:start w:w="100" w:type="dxa"/>
+              <w:bottom w:w="50" w:type="dxa"/>
+              <w:end w:w="100" w:type="dxa"/>
+            </w:tcMar>
+          </w:tcPr>
+          <w:p>
+            <w:pPr>
+              <w:keepNext/>
+              <w:spacing w:after="0"/>
+              <w:jc w:val="center"/>
+            </w:pPr>
+            <w:r>
+              <w:rPr>
+                <w:rFonts w:ascii="Times New Roman" w:hAnsi="Times New Roman" w:eastAsia="Times New Roman"/>
+                <w:sz w:val="20"/>
+              </w:rPr>
+              <w:t>0,117%</w:t>
+            </w:r>
+          </w:p>
+        </w:tc>
+      </w:tr>
+      <w:tr>
+        <w:trPr>
+          <w:cantSplit w:val="true"/>
+        </w:trPr>
+        <w:tc>
+          <w:tcPr>
+            <w:tcW w:type="dxa" w:w="2300"/>
+            <w:vAlign w:val="center"/>
+            <w:tcMar>
+              <w:top w:w="50" w:type="dxa"/>
+              <w:start w:w="100" w:type="dxa"/>
+              <w:bottom w:w="50" w:type="dxa"/>
+              <w:end w:w="100" w:type="dxa"/>
+            </w:tcMar>
+          </w:tcPr>
+          <w:p>
+            <w:pPr>
+              <w:keepNext/>
+              <w:spacing w:after="0"/>
+              <w:jc w:val="left"/>
+            </w:pPr>
+            <w:r>
+              <w:rPr>
+                <w:rFonts w:ascii="Times New Roman" w:hAnsi="Times New Roman" w:eastAsia="Times New Roman"/>
+                <w:sz w:val="20"/>
+              </w:rPr>
+              <w:t>24–36 giờ</w:t>
+            </w:r>
+          </w:p>
+        </w:tc>
+        <w:tc>
+          <w:tcPr>
+            <w:tcW w:type="dxa" w:w="2050"/>
+            <w:vAlign w:val="center"/>
+            <w:tcMar>
+              <w:top w:w="50" w:type="dxa"/>
+              <w:start w:w="100" w:type="dxa"/>
+              <w:bottom w:w="50" w:type="dxa"/>
+              <w:end w:w="100" w:type="dxa"/>
+            </w:tcMar>
+          </w:tcPr>
+          <w:p>
+            <w:pPr>
+              <w:keepNext/>
+              <w:spacing w:after="0"/>
+              <w:jc w:val="center"/>
+            </w:pPr>
+            <w:r>
+              <w:rPr>
+                <w:rFonts w:ascii="Times New Roman" w:hAnsi="Times New Roman" w:eastAsia="Times New Roman"/>
+                <w:sz w:val="20"/>
+              </w:rPr>
+              <w:t>28303</w:t>
+            </w:r>
+          </w:p>
+        </w:tc>
+        <w:tc>
+          <w:tcPr>
+            <w:tcW w:type="dxa" w:w="2050"/>
+            <w:vAlign w:val="center"/>
+            <w:tcMar>
+              <w:top w:w="50" w:type="dxa"/>
+              <w:start w:w="100" w:type="dxa"/>
+              <w:bottom w:w="50" w:type="dxa"/>
+              <w:end w:w="100" w:type="dxa"/>
+            </w:tcMar>
+          </w:tcPr>
+          <w:p>
+            <w:pPr>
+              <w:keepNext/>
+              <w:spacing w:after="0"/>
+              <w:jc w:val="center"/>
+            </w:pPr>
+            <w:r>
+              <w:rPr>
+                <w:rFonts w:ascii="Times New Roman" w:hAnsi="Times New Roman" w:eastAsia="Times New Roman"/>
+                <w:sz w:val="20"/>
+              </w:rPr>
+              <w:t>53</w:t>
+            </w:r>
+          </w:p>
+        </w:tc>
+        <w:tc>
+          <w:tcPr>
+            <w:tcW w:type="dxa" w:w="2456"/>
+            <w:vAlign w:val="center"/>
+            <w:tcMar>
+              <w:top w:w="50" w:type="dxa"/>
+              <w:start w:w="100" w:type="dxa"/>
+              <w:bottom w:w="50" w:type="dxa"/>
+              <w:end w:w="100" w:type="dxa"/>
+            </w:tcMar>
+          </w:tcPr>
+          <w:p>
+            <w:pPr>
+              <w:keepNext/>
+              <w:spacing w:after="0"/>
+              <w:jc w:val="center"/>
+            </w:pPr>
+            <w:r>
+              <w:rPr>
+                <w:rFonts w:ascii="Times New Roman" w:hAnsi="Times New Roman" w:eastAsia="Times New Roman"/>
+                <w:sz w:val="20"/>
+              </w:rPr>
+              <w:t>0,187%</w:t>
+            </w:r>
+          </w:p>
+        </w:tc>
+      </w:tr>
+      <w:tr>
+        <w:trPr>
+          <w:cantSplit w:val="true"/>
+        </w:trPr>
+        <w:tc>
+          <w:tcPr>
+            <w:tcW w:type="dxa" w:w="2300"/>
+            <w:shd w:fill="FFFFFF"/>
+            <w:vAlign w:val="center"/>
+            <w:tcMar>
+              <w:top w:w="50" w:type="dxa"/>
+              <w:start w:w="100" w:type="dxa"/>
+              <w:bottom w:w="50" w:type="dxa"/>
+              <w:end w:w="100" w:type="dxa"/>
+            </w:tcMar>
+          </w:tcPr>
+          <w:p>
+            <w:pPr>
+              <w:spacing w:after="0"/>
+              <w:jc w:val="left"/>
+            </w:pPr>
+            <w:r>
+              <w:rPr>
+                <w:rFonts w:ascii="Times New Roman" w:hAnsi="Times New Roman" w:eastAsia="Times New Roman"/>
+                <w:sz w:val="20"/>
+              </w:rPr>
+              <w:t>36–48+ giờ</w:t>
+            </w:r>
+          </w:p>
+        </w:tc>
+        <w:tc>
+          <w:tcPr>
+            <w:tcW w:type="dxa" w:w="2050"/>
+            <w:shd w:fill="FFFFFF"/>
+            <w:vAlign w:val="center"/>
+            <w:tcMar>
+              <w:top w:w="50" w:type="dxa"/>
+              <w:start w:w="100" w:type="dxa"/>
+              <w:bottom w:w="50" w:type="dxa"/>
+              <w:end w:w="100" w:type="dxa"/>
+            </w:tcMar>
+          </w:tcPr>
+          <w:p>
+            <w:pPr>
+              <w:spacing w:after="0"/>
+              <w:jc w:val="center"/>
+            </w:pPr>
+            <w:r>
+              <w:rPr>
+                <w:rFonts w:ascii="Times New Roman" w:hAnsi="Times New Roman" w:eastAsia="Times New Roman"/>
+                <w:sz w:val="20"/>
+              </w:rPr>
+              <w:t>55496</w:t>
+            </w:r>
+          </w:p>
+        </w:tc>
+        <w:tc>
+          <w:tcPr>
+            <w:tcW w:type="dxa" w:w="2050"/>
+            <w:shd w:fill="FFFFFF"/>
+            <w:vAlign w:val="center"/>
+            <w:tcMar>
+              <w:top w:w="50" w:type="dxa"/>
+              <w:start w:w="100" w:type="dxa"/>
+              <w:bottom w:w="50" w:type="dxa"/>
+              <w:end w:w="100" w:type="dxa"/>
+            </w:tcMar>
+          </w:tcPr>
+          <w:p>
+            <w:pPr>
+              <w:spacing w:after="0"/>
+              <w:jc w:val="center"/>
+            </w:pPr>
+            <w:r>
+              <w:rPr>
+                <w:rFonts w:ascii="Times New Roman" w:hAnsi="Times New Roman" w:eastAsia="Times New Roman"/>
+                <w:sz w:val="20"/>
+              </w:rPr>
+              <w:t>72</w:t>
+            </w:r>
+          </w:p>
+        </w:tc>
+        <w:tc>
+          <w:tcPr>
+            <w:tcW w:type="dxa" w:w="2456"/>
+            <w:shd w:fill="FFFFFF"/>
+            <w:vAlign w:val="center"/>
+            <w:tcMar>
+              <w:top w:w="50" w:type="dxa"/>
+              <w:start w:w="100" w:type="dxa"/>
+              <w:bottom w:w="50" w:type="dxa"/>
+              <w:end w:w="100" w:type="dxa"/>
+            </w:tcMar>
+          </w:tcPr>
+          <w:p>
+            <w:pPr>
+              <w:spacing w:after="0"/>
+              <w:jc w:val="center"/>
+            </w:pPr>
+            <w:r>
+              <w:rPr>
+                <w:rFonts w:ascii="Times New Roman" w:hAnsi="Times New Roman" w:eastAsia="Times New Roman"/>
+                <w:sz w:val="20"/>
+              </w:rPr>
+              <w:t>0,130%</w:t>
+            </w:r>
+          </w:p>
+        </w:tc>
+      </w:tr>
+    </w:tbl>
+    <w:p>
+      <w:pPr>
+        <w:spacing w:line="40" w:lineRule="exact" w:after="80"/>
+      </w:pPr>
+      <w:r>
+        <w:rPr>
+          <w:sz w:val="4"/>
+        </w:rPr>
+      </w:r>
+    </w:p>
+    <w:p>
+      <w:pPr>
+        <w:spacing w:line="300" w:lineRule="auto" w:after="80"/>
+        <w:ind w:firstLine="720"/>
+        <w:jc w:val="both"/>
+      </w:pPr>
+      <w:r>
+        <w:rPr>
+          <w:rFonts w:ascii="Times New Roman" w:hAnsi="Times New Roman" w:eastAsia="Times New Roman"/>
+          <w:i w:val="0"/>
+          <w:sz w:val="26"/>
+        </w:rPr>
+        <w:t>Bảng pivot đếm từng dòng train theo bốn cửa sổ Time và Class. Time là giây tương đối nên các cửa sổ này không mô tả giờ trong ngày hay xu hướng ở dữ liệu tương lai.</w:t>
+      </w:r>
+    </w:p>
+    <w:p>
+      <w:pPr>
+        <w:pStyle w:val="Caption"/>
+        <w:keepNext/>
+        <w:spacing w:before="100" w:after="60"/>
+        <w:jc w:val="center"/>
+      </w:pPr>
+      <w:r>
+        <w:rPr>
+          <w:rFonts w:ascii="Times New Roman" w:hAnsi="Times New Roman" w:eastAsia="Times New Roman"/>
+          <w:b/>
+          <w:color w:val="000000"/>
+          <w:sz w:val="21"/>
+        </w:rPr>
+        <w:t>Hình 3.5. Seaborn đa biến trên train</w:t>
+      </w:r>
+    </w:p>
+    <w:p>
+      <w:pPr>
+        <w:keepNext/>
+        <w:jc w:val="center"/>
+      </w:pPr>
+      <w:r>
+        <w:drawing>
+          <wp:inline xmlns:a="http://schemas.openxmlformats.org/drawingml/2006/main" xmlns:pic="http://schemas.openxmlformats.org/drawingml/2006/picture">
+            <wp:extent cx="5029200" cy="3325558"/>
+            <wp:docPr id="1149450721" name="Picture 1149450721" descr="Hình 3.5. Seaborn đa biến trên train"/>
+            <wp:cNvGraphicFramePr>
+              <a:graphicFrameLocks noChangeAspect="1"/>
+            </wp:cNvGraphicFramePr>
+            <a:graphic>
+              <a:graphicData uri="http://schemas.openxmlformats.org/drawingml/2006/picture">
+                <pic:pic>
+                  <pic:nvPicPr>
+                    <pic:cNvPr id="0" name="eda_seaborn_multivariate.png"/>
+                    <pic:cNvPicPr/>
+                  </pic:nvPicPr>
+                  <pic:blipFill>
+                    <a:blip r:embed="rId30"/>
+                    <a:stretch>
+                      <a:fillRect/>
+                    </a:stretch>
+                  </pic:blipFill>
+                  <pic:spPr>
+                    <a:xfrm>
+                      <a:off x="0" y="0"/>
+                      <a:ext cx="5029200" cy="3325558"/>
+                    </a:xfrm>
+                    <a:prstGeom prst="rect"/>
+                  </pic:spPr>
+                </pic:pic>
+              </a:graphicData>
+            </a:graphic>
+          </wp:inline>
+        </w:drawing>
+      </w:r>
+    </w:p>
+    <w:p>
+      <w:pPr>
+        <w:spacing w:line="300" w:lineRule="auto" w:after="140"/>
+        <w:jc w:val="both"/>
+      </w:pPr>
+      <w:r>
+        <w:rPr>
+          <w:rFonts w:ascii="Times New Roman" w:hAnsi="Times New Roman" w:eastAsia="Times New Roman"/>
+          <w:i/>
+          <w:sz w:val="26"/>
+        </w:rPr>
+        <w:t>Hai trục biểu diễn V14 và V17, màu chỉ Class, còn cỡ điểm biểu diễn LogAmount. Hình giữ toàn bộ 284 fraud và lấy mẫu 5.000 giao dịch hợp lệ để lớp hiếm nhìn rõ; tỷ lệ màu không đại diện cho prevalence, và hai lớp vẫn có vùng chồng lấp.</w:t>
       </w:r>
     </w:p>
     <w:p>
@@ -7960,7 +8669,7 @@
           <w:color w:val="000000"/>
           <w:sz w:val="21"/>
         </w:rPr>
-        <w:t>Bảng 3.3. So sánh validation và metric tại threshold tối đa F1</w:t>
+        <w:t>Bảng 3.4. So sánh validation và metric tại threshold tối đa F1</w:t>
       </w:r>
     </w:p>
     <w:tbl>
@@ -8899,7 +9608,7 @@
           <w:color w:val="000000"/>
           <w:sz w:val="21"/>
         </w:rPr>
-        <w:t>Hình 3.5. Precision Recall trên validation</w:t>
+        <w:t>Hình 3.6. Precision Recall trên validation</w:t>
       </w:r>
     </w:p>
     <w:p>
@@ -8911,7 +9620,7 @@
         <w:drawing>
           <wp:inline xmlns:a="http://schemas.openxmlformats.org/drawingml/2006/main" xmlns:pic="http://schemas.openxmlformats.org/drawingml/2006/picture">
             <wp:extent cx="5394960" cy="3932725"/>
-            <wp:docPr id="1149450721" name="Picture 1149450721" descr="Hình 3.5. Precision Recall trên validation"/>
+            <wp:docPr id="1149450722" name="Picture 1149450722" descr="Hình 3.6. Precision Recall trên validation"/>
             <wp:cNvGraphicFramePr>
               <a:graphicFrameLocks noChangeAspect="1"/>
             </wp:cNvGraphicFramePr>
@@ -8923,7 +9632,7 @@
                     <pic:cNvPicPr/>
                   </pic:nvPicPr>
                   <pic:blipFill>
-                    <a:blip r:embed="rId30"/>
+                    <a:blip r:embed="rId31"/>
                     <a:stretch>
                       <a:fillRect/>
                     </a:stretch>
@@ -8988,7 +9697,7 @@
           <w:color w:val="000000"/>
           <w:sz w:val="21"/>
         </w:rPr>
-        <w:t>Bảng 3.4a. Hiệu quả xếp hạng của model đã khóa trên test</w:t>
+        <w:t>Bảng 3.5a. Hiệu quả xếp hạng của model đã khóa trên test</w:t>
       </w:r>
     </w:p>
     <w:tbl>
@@ -9316,7 +10025,7 @@
           <w:color w:val="000000"/>
           <w:sz w:val="21"/>
         </w:rPr>
-        <w:t>Bảng 3.4b. Kết quả tại threshold đã khóa</w:t>
+        <w:t>Bảng 3.5b. Kết quả tại threshold đã khóa</w:t>
       </w:r>
     </w:p>
     <w:tbl>
@@ -9821,7 +10530,7 @@
           <w:color w:val="000000"/>
           <w:sz w:val="21"/>
         </w:rPr>
-        <w:t>Hình 3.6. Precision-Recall trên test đã khóa</w:t>
+        <w:t>Hình 3.7. Precision-Recall trên test đã khóa</w:t>
       </w:r>
     </w:p>
     <w:p>
@@ -9833,7 +10542,7 @@
         <w:drawing>
           <wp:inline xmlns:a="http://schemas.openxmlformats.org/drawingml/2006/main" xmlns:pic="http://schemas.openxmlformats.org/drawingml/2006/picture">
             <wp:extent cx="5394960" cy="3932725"/>
-            <wp:docPr id="1149450722" name="Picture 1149450722" descr="Hình 3.6. Precision-Recall trên test đã khóa"/>
+            <wp:docPr id="1149450723" name="Picture 1149450723" descr="Hình 3.7. Precision-Recall trên test đã khóa"/>
             <wp:cNvGraphicFramePr>
               <a:graphicFrameLocks noChangeAspect="1"/>
             </wp:cNvGraphicFramePr>
@@ -9845,7 +10554,7 @@
                     <pic:cNvPicPr/>
                   </pic:nvPicPr>
                   <pic:blipFill>
-                    <a:blip r:embed="rId31"/>
+                    <a:blip r:embed="rId32"/>
                     <a:stretch>
                       <a:fillRect/>
                     </a:stretch>
@@ -9875,7 +10584,7 @@
           <w:i/>
           <w:sz w:val="26"/>
         </w:rPr>
-        <w:t>AP được tính trực tiếp từ score liên tục bằng average_precision_score; test không được dùng để đổi model hoặc threshold.</w:t>
+        <w:t>AP được tính trực tiếp từ score liên tục bằng average_precision_score. Đường PR trên test chỉ dùng để mô tả kết quả sau khi khóa mô hình và ngưỡng trên validation.</w:t>
       </w:r>
     </w:p>
     <w:p>
@@ -9892,7 +10601,7 @@
           <w:color w:val="000000"/>
           <w:sz w:val="21"/>
         </w:rPr>
-        <w:t>Hình 3.7. Confusion matrix tại threshold đã khóa</w:t>
+        <w:t>Hình 3.8. Confusion matrix tại threshold đã khóa</w:t>
       </w:r>
     </w:p>
     <w:p>
@@ -9904,7 +10613,7 @@
         <w:drawing>
           <wp:inline xmlns:a="http://schemas.openxmlformats.org/drawingml/2006/main" xmlns:pic="http://schemas.openxmlformats.org/drawingml/2006/picture">
             <wp:extent cx="5394960" cy="4353487"/>
-            <wp:docPr id="1149450723" name="Picture 1149450723" descr="Hình 3.7. Confusion matrix tại threshold đã khóa"/>
+            <wp:docPr id="1149450724" name="Picture 1149450724" descr="Hình 3.8. Confusion matrix tại threshold đã khóa"/>
             <wp:cNvGraphicFramePr>
               <a:graphicFrameLocks noChangeAspect="1"/>
             </wp:cNvGraphicFramePr>
@@ -9916,7 +10625,7 @@
                     <pic:cNvPicPr/>
                   </pic:nvPicPr>
                   <pic:blipFill>
-                    <a:blip r:embed="rId32"/>
+                    <a:blip r:embed="rId33"/>
                     <a:stretch>
                       <a:fillRect/>
                     </a:stretch>
@@ -9980,7 +10689,7 @@
           <w:color w:val="000000"/>
           <w:sz w:val="21"/>
         </w:rPr>
-        <w:t>Bảng 3.5. Hiệu quả theo năng lực kiểm tra</w:t>
+        <w:t>Bảng 3.6. Hiệu quả theo năng lực kiểm tra</w:t>
       </w:r>
     </w:p>
     <w:tbl>
@@ -10812,7 +11521,7 @@
           <w:color w:val="000000"/>
           <w:sz w:val="21"/>
         </w:rPr>
-        <w:t>Hình 3.8. Recall và Lift theo Top-p</w:t>
+        <w:t>Hình 3.9. Recall và Lift theo Top-p</w:t>
       </w:r>
     </w:p>
     <w:p>
@@ -10824,7 +11533,7 @@
         <w:drawing>
           <wp:inline xmlns:a="http://schemas.openxmlformats.org/drawingml/2006/main" xmlns:pic="http://schemas.openxmlformats.org/drawingml/2006/picture">
             <wp:extent cx="5394960" cy="2409724"/>
-            <wp:docPr id="1149450724" name="Picture 1149450724" descr="Hình 3.8. Recall và Lift theo Top-p"/>
+            <wp:docPr id="1149450725" name="Picture 1149450725" descr="Hình 3.9. Recall và Lift theo Top-p"/>
             <wp:cNvGraphicFramePr>
               <a:graphicFrameLocks noChangeAspect="1"/>
             </wp:cNvGraphicFramePr>
@@ -10836,7 +11545,7 @@
                     <pic:cNvPicPr/>
                   </pic:nvPicPr>
                   <pic:blipFill>
-                    <a:blip r:embed="rId33"/>
+                    <a:blip r:embed="rId34"/>
                     <a:stretch>
                       <a:fillRect/>
                     </a:stretch>
@@ -10866,7 +11575,7 @@
           <w:i/>
           <w:sz w:val="26"/>
         </w:rPr>
-        <w:t>Recall tăng chậm khi mở rộng p, trong khi Lift giảm mạnh vì danh sách chứa nhiều giao dịch hợp lệ hơn.</w:t>
+        <w:t>Recall tăng khi mở rộng p, trong khi Lift giảm vì danh sách chứa thêm giao dịch hợp lệ. Chọn p theo năng lực kiểm tra; không thể coi cùng một p là tối ưu cho mọi chi phí vận hành.</w:t>
       </w:r>
     </w:p>
     <w:p>
@@ -10900,7 +11609,7 @@
           <w:color w:val="000000"/>
           <w:sz w:val="21"/>
         </w:rPr>
-        <w:t>Bảng 3.6. Mẫu lỗi được kiểm tra</w:t>
+        <w:t>Bảng 3.7. Mẫu lỗi được kiểm tra</w:t>
       </w:r>
     </w:p>
     <w:tbl>
@@ -11275,6 +11984,77 @@
     </w:p>
     <w:p>
       <w:pPr>
+        <w:pStyle w:val="Caption"/>
+        <w:keepNext/>
+        <w:spacing w:before="100" w:after="60"/>
+        <w:jc w:val="center"/>
+      </w:pPr>
+      <w:r>
+        <w:rPr>
+          <w:rFonts w:ascii="Times New Roman" w:hAnsi="Times New Roman" w:eastAsia="Times New Roman"/>
+          <w:b/>
+          <w:color w:val="000000"/>
+          <w:sz w:val="21"/>
+        </w:rPr>
+        <w:t>Hình 3.10. Seaborn đa biến trên mẫu FP/FN của test đã khóa</w:t>
+      </w:r>
+    </w:p>
+    <w:p>
+      <w:pPr>
+        <w:keepNext/>
+        <w:jc w:val="center"/>
+      </w:pPr>
+      <w:r>
+        <w:drawing>
+          <wp:inline xmlns:a="http://schemas.openxmlformats.org/drawingml/2006/main" xmlns:pic="http://schemas.openxmlformats.org/drawingml/2006/picture">
+            <wp:extent cx="5029200" cy="2689559"/>
+            <wp:docPr id="1149450726" name="Picture 1149450726" descr="Hình 3.10. Seaborn đa biến trên mẫu FP/FN của test đã khóa"/>
+            <wp:cNvGraphicFramePr>
+              <a:graphicFrameLocks noChangeAspect="1"/>
+            </wp:cNvGraphicFramePr>
+            <a:graphic>
+              <a:graphicData uri="http://schemas.openxmlformats.org/drawingml/2006/picture">
+                <pic:pic>
+                  <pic:nvPicPr>
+                    <pic:cNvPr id="0" name="seaborn_error_cases_multivariate.png"/>
+                    <pic:cNvPicPr/>
+                  </pic:nvPicPr>
+                  <pic:blipFill>
+                    <a:blip r:embed="rId35"/>
+                    <a:stretch>
+                      <a:fillRect/>
+                    </a:stretch>
+                  </pic:blipFill>
+                  <pic:spPr>
+                    <a:xfrm>
+                      <a:off x="0" y="0"/>
+                      <a:ext cx="5029200" cy="2689559"/>
+                    </a:xfrm>
+                    <a:prstGeom prst="rect"/>
+                  </pic:spPr>
+                </pic:pic>
+              </a:graphicData>
+            </a:graphic>
+          </wp:inline>
+        </w:drawing>
+      </w:r>
+    </w:p>
+    <w:p>
+      <w:pPr>
+        <w:spacing w:line="300" w:lineRule="auto" w:after="140"/>
+        <w:jc w:val="both"/>
+      </w:pPr>
+      <w:r>
+        <w:rPr>
+          <w:rFonts w:ascii="Times New Roman" w:hAnsi="Times New Roman" w:eastAsia="Times New Roman"/>
+          <w:i/>
+          <w:sz w:val="26"/>
+        </w:rPr>
+        <w:t>Mười cảnh báo nhầm và mười giao dịch bị bỏ sót được mô tả theo LogAmount, V14, loại lỗi và score. Đây là 20 trường hợp được chọn sau khi đánh giá test, không đại diện toàn bộ phân bố test và không dùng để thay đổi mô hình hoặc threshold.</w:t>
+      </w:r>
+    </w:p>
+    <w:p>
+      <w:pPr>
         <w:spacing w:line="300" w:lineRule="auto" w:after="80"/>
         <w:ind w:firstLine="720"/>
         <w:jc w:val="both"/>
@@ -11302,7 +12082,7 @@
           <w:color w:val="000000"/>
           <w:sz w:val="21"/>
         </w:rPr>
-        <w:t>Hình 3.9. Feature importance của Random Forest</w:t>
+        <w:t>Hình 3.11. Feature importance của Random Forest</w:t>
       </w:r>
     </w:p>
     <w:p>
@@ -11314,7 +12094,7 @@
         <w:drawing>
           <wp:inline xmlns:a="http://schemas.openxmlformats.org/drawingml/2006/main" xmlns:pic="http://schemas.openxmlformats.org/drawingml/2006/picture">
             <wp:extent cx="5394960" cy="4242425"/>
-            <wp:docPr id="1149450725" name="Picture 1149450725" descr="Hình 3.9. Feature importance của Random Forest"/>
+            <wp:docPr id="1149450727" name="Picture 1149450727" descr="Hình 3.11. Feature importance của Random Forest"/>
             <wp:cNvGraphicFramePr>
               <a:graphicFrameLocks noChangeAspect="1"/>
             </wp:cNvGraphicFramePr>
@@ -11326,7 +12106,7 @@
                     <pic:cNvPicPr/>
                   </pic:nvPicPr>
                   <pic:blipFill>
-                    <a:blip r:embed="rId34"/>
+                    <a:blip r:embed="rId36"/>
                     <a:stretch>
                       <a:fillRect/>
                     </a:stretch>
@@ -12146,7 +12926,7 @@
           <w:rFonts w:ascii="Times New Roman" w:hAnsi="Times New Roman" w:eastAsia="Times New Roman"/>
           <w:sz w:val="26"/>
         </w:rPr>
-        <w:t>EDA chỉ trên train và xuất bốn hình.</w:t>
+        <w:t>EDA chỉ trên train, pivot_table và năm hình gồm Seaborn đa biến.</w:t>
       </w:r>
     </w:p>
     <w:p>
@@ -13027,6 +13807,21 @@
           <w:sz w:val="26"/>
         </w:rPr>
         <w:t>[13] Nguyễn Mạnh Hùng, Python for Data Science, Buổi 1, ngày 17/08/2026, slide 26–30. Tài liệu học phần Cơ sở Khoa học Dữ liệu.</w:t>
+      </w:r>
+    </w:p>
+    <w:p>
+      <w:pPr>
+        <w:spacing w:line="240" w:lineRule="auto" w:after="80"/>
+        <w:ind w:left="360" w:hanging="360"/>
+        <w:jc w:val="left"/>
+      </w:pPr>
+      <w:r>
+        <w:rPr>
+          <w:rFonts w:ascii="Times New Roman" w:hAnsi="Times New Roman" w:eastAsia="Times New Roman"/>
+          <w:i w:val="0"/>
+          <w:sz w:val="26"/>
+        </w:rPr>
+        <w:t>[14] Nguyễn Mạnh Hùng, Python for Data Science, Buổi 9, ngày 19/08/2026, slide 77–78. Yêu cầu và cấu trúc đồ án giữa kỳ.</w:t>
       </w:r>
     </w:p>
     <w:sectPr>

</xml_diff>

<commit_message>
Hoàn thiện ECCC-LITE theo EDA Buổi 9
Bổ sung pivot_table trên train, hai hình Seaborn tái lập, notebook đã chạy kiểm chứng, báo cáo 22 trang và đối chiếu hash.
</commit_message>
<xml_diff>
--- a/ECCC-LITE-FINAL/reports/BaoCao_NOP.docx
+++ b/ECCC-LITE-FINAL/reports/BaoCao_NOP.docx
@@ -1802,7 +1802,7 @@
         </w:rPr>
         <w:t>3.4. Kết quả test cuối</w:t>
         <w:tab/>
-        <w:t>11</w:t>
+        <w:t>12</w:t>
       </w:r>
     </w:p>
     <w:p>
@@ -1822,7 +1822,7 @@
         </w:rPr>
         <w:t>3.5. Kết quả Top-p</w:t>
         <w:tab/>
-        <w:t>12</w:t>
+        <w:t>13</w:t>
       </w:r>
     </w:p>
     <w:p>
@@ -1842,7 +1842,7 @@
         </w:rPr>
         <w:t>3.6. Phân tích False Positive, False Negative và feature importance</w:t>
         <w:tab/>
-        <w:t>13</w:t>
+        <w:t>14</w:t>
       </w:r>
     </w:p>
     <w:p>
@@ -1862,7 +1862,7 @@
         </w:rPr>
         <w:t>3.7. Thảo luận kết quả và giới hạn</w:t>
         <w:tab/>
-        <w:t>14</w:t>
+        <w:t>15</w:t>
       </w:r>
     </w:p>
     <w:p>
@@ -1882,7 +1882,7 @@
         </w:rPr>
         <w:t>PHẦN KẾT LUẬN</w:t>
         <w:tab/>
-        <w:t>15</w:t>
+        <w:t>16</w:t>
       </w:r>
     </w:p>
     <w:p>
@@ -1902,7 +1902,7 @@
         </w:rPr>
         <w:t>PHỤ LỤC A: TỔ CHỨC REPOSITORY VÀ NOTEBOOK</w:t>
         <w:tab/>
-        <w:t>16</w:t>
+        <w:t>17</w:t>
       </w:r>
     </w:p>
     <w:p>
@@ -1922,7 +1922,7 @@
         </w:rPr>
         <w:t>A.1. 01_data_eda.ipynb - Hoan</w:t>
         <w:tab/>
-        <w:t>16</w:t>
+        <w:t>17</w:t>
       </w:r>
     </w:p>
     <w:p>
@@ -1942,7 +1942,7 @@
         </w:rPr>
         <w:t>A.2. 02_modeling.ipynb - Huy</w:t>
         <w:tab/>
-        <w:t>16</w:t>
+        <w:t>17</w:t>
       </w:r>
     </w:p>
     <w:p>
@@ -1962,7 +1962,7 @@
         </w:rPr>
         <w:t>A.3. 03_evaluation.ipynb - Sang</w:t>
         <w:tab/>
-        <w:t>16</w:t>
+        <w:t>17</w:t>
       </w:r>
     </w:p>
     <w:p>
@@ -1982,7 +1982,7 @@
         </w:rPr>
         <w:t>A.4. Fraud_Project_Final.ipynb - cả nhóm</w:t>
         <w:tab/>
-        <w:t>16</w:t>
+        <w:t>17</w:t>
       </w:r>
     </w:p>
     <w:p>
@@ -2002,7 +2002,7 @@
         </w:rPr>
         <w:t>PHỤ LỤC B: PHÂN CÔNG VÀ TRẠNG THÁI HOÀN THÀNH</w:t>
         <w:tab/>
-        <w:t>17</w:t>
+        <w:t>18</w:t>
       </w:r>
     </w:p>
     <w:p>
@@ -2022,7 +2022,7 @@
         </w:rPr>
         <w:t>TÀI LIỆU THAM KHẢO</w:t>
         <w:tab/>
-        <w:t>18</w:t>
+        <w:t>19</w:t>
       </w:r>
       <w:r>
         <w:fldChar w:fldCharType="end"/>
@@ -2035,8 +2035,8 @@
           <w:szCs w:val="26"/>
         </w:rPr>
         <w:sectPr>
-          <w:headerReference w:type="default" r:id="rId35"/>
-          <w:footerReference w:type="default" r:id="rId36"/>
+          <w:headerReference w:type="default" r:id="rId37"/>
+          <w:footerReference w:type="default" r:id="rId38"/>
           <w:pgSz w:w="11906" w:h="16838"/>
           <w:pgMar w:top="1418" w:right="1134" w:bottom="851" w:left="1701" w:header="454" w:footer="340" w:gutter="0"/>
           <w:cols w:space="720"/>
@@ -5566,6 +5566,20 @@
     </w:p>
     <w:p>
       <w:pPr>
+        <w:pStyle w:val="ListBullet"/>
+        <w:spacing w:after="40"/>
+        <w:jc w:val="both"/>
+      </w:pPr>
+      <w:r>
+        <w:rPr>
+          <w:rFonts w:ascii="Times New Roman" w:hAnsi="Times New Roman" w:eastAsia="Times New Roman"/>
+          <w:sz w:val="26"/>
+        </w:rPr>
+        <w:t>Pivot Time × Class và biểu đồ Seaborn đa biến V14, V17, Class, LogAmount chỉ trên train [14].</w:t>
+      </w:r>
+    </w:p>
+    <w:p>
+      <w:pPr>
         <w:pStyle w:val="Heading2"/>
         <w:keepNext/>
       </w:pPr>
@@ -7670,7 +7684,7 @@
       <w:r>
         <w:drawing>
           <wp:inline xmlns:a="http://schemas.openxmlformats.org/drawingml/2006/main" xmlns:pic="http://schemas.openxmlformats.org/drawingml/2006/picture">
-            <wp:extent cx="5394960" cy="3437112"/>
+            <wp:extent cx="5394960" cy="3425647"/>
             <wp:docPr id="1149450717" name="Picture 1149450717" descr="Hình 3.1. Phân bố Class trên train"/>
             <wp:cNvGraphicFramePr>
               <a:graphicFrameLocks noChangeAspect="1"/>
@@ -7691,7 +7705,7 @@
                   <pic:spPr>
                     <a:xfrm>
                       <a:off x="0" y="0"/>
-                      <a:ext cx="5394960" cy="3437112"/>
+                      <a:ext cx="5394960" cy="3425647"/>
                     </a:xfrm>
                     <a:prstGeom prst="rect"/>
                   </pic:spPr>
@@ -7713,7 +7727,7 @@
           <w:i/>
           <w:sz w:val="26"/>
         </w:rPr>
-        <w:t>Train chỉ có 284 fraud trên 170.235 giao dịch (0,167%), xác nhận Accuracy đơn lẻ không phù hợp để chọn mô hình.</w:t>
+        <w:t>Train chỉ có 284 fraud trên 170.235 giao dịch (0,167%). Accuracy đơn lẻ không phù hợp để chọn mô hình vì dự đoán toàn bộ là hợp lệ vẫn cho giá trị cao mà bỏ sót mọi fraud.</w:t>
       </w:r>
     </w:p>
     <w:p>
@@ -7741,7 +7755,7 @@
       <w:r>
         <w:drawing>
           <wp:inline xmlns:a="http://schemas.openxmlformats.org/drawingml/2006/main" xmlns:pic="http://schemas.openxmlformats.org/drawingml/2006/picture">
-            <wp:extent cx="5394960" cy="1986555"/>
+            <wp:extent cx="5394960" cy="1983107"/>
             <wp:docPr id="1149450718" name="Picture 1149450718" descr="Hình 3.2. Amount/LogAmount theo Class"/>
             <wp:cNvGraphicFramePr>
               <a:graphicFrameLocks noChangeAspect="1"/>
@@ -7762,7 +7776,7 @@
                   <pic:spPr>
                     <a:xfrm>
                       <a:off x="0" y="0"/>
-                      <a:ext cx="5394960" cy="1986555"/>
+                      <a:ext cx="5394960" cy="1983107"/>
                     </a:xfrm>
                     <a:prstGeom prst="rect"/>
                   </pic:spPr>
@@ -7812,7 +7826,7 @@
       <w:r>
         <w:drawing>
           <wp:inline xmlns:a="http://schemas.openxmlformats.org/drawingml/2006/main" xmlns:pic="http://schemas.openxmlformats.org/drawingml/2006/picture">
-            <wp:extent cx="5394960" cy="2658679"/>
+            <wp:extent cx="5394960" cy="2657018"/>
             <wp:docPr id="1149450719" name="Picture 1149450719" descr="Hình 3.3. Time theo Class"/>
             <wp:cNvGraphicFramePr>
               <a:graphicFrameLocks noChangeAspect="1"/>
@@ -7833,7 +7847,7 @@
                   <pic:spPr>
                     <a:xfrm>
                       <a:off x="0" y="0"/>
-                      <a:ext cx="5394960" cy="2658679"/>
+                      <a:ext cx="5394960" cy="2657018"/>
                     </a:xfrm>
                     <a:prstGeom prst="rect"/>
                   </pic:spPr>
@@ -7883,7 +7897,7 @@
       <w:r>
         <w:drawing>
           <wp:inline xmlns:a="http://schemas.openxmlformats.org/drawingml/2006/main" xmlns:pic="http://schemas.openxmlformats.org/drawingml/2006/picture">
-            <wp:extent cx="5394960" cy="3675103"/>
+            <wp:extent cx="5394960" cy="3671306"/>
             <wp:docPr id="1149450720" name="Picture 1149450720" descr="Hình 3.4. Tương quan chọn lọc trên train"/>
             <wp:cNvGraphicFramePr>
               <a:graphicFrameLocks noChangeAspect="1"/>
@@ -7904,7 +7918,7 @@
                   <pic:spPr>
                     <a:xfrm>
                       <a:off x="0" y="0"/>
-                      <a:ext cx="5394960" cy="3675103"/>
+                      <a:ext cx="5394960" cy="3671306"/>
                     </a:xfrm>
                     <a:prstGeom prst="rect"/>
                   </pic:spPr>
@@ -7927,6 +7941,701 @@
           <w:sz w:val="26"/>
         </w:rPr>
         <w:t>V17 có |tương quan Pearson| lớn nhất trong bảng chọn lọc (-0,3197). Đây chỉ là liên hệ thống kê trên train; V1-V28 không được gán ý nghĩa nghiệp vụ.</w:t>
+      </w:r>
+    </w:p>
+    <w:p>
+      <w:pPr>
+        <w:pStyle w:val="Caption"/>
+        <w:keepNext/>
+        <w:spacing w:before="100" w:after="60"/>
+        <w:jc w:val="center"/>
+      </w:pPr>
+      <w:r>
+        <w:rPr>
+          <w:rFonts w:ascii="Times New Roman" w:hAnsi="Times New Roman" w:eastAsia="Times New Roman"/>
+          <w:b/>
+          <w:color w:val="000000"/>
+          <w:sz w:val="21"/>
+        </w:rPr>
+        <w:t>Bảng 3.3. Pivot Time theo Class từ từng giao dịch train</w:t>
+      </w:r>
+    </w:p>
+    <w:tbl>
+      <w:tblPr>
+        <w:tblStyle w:val="TableGrid"/>
+        <w:tblW w:type="dxa" w:w="8856"/>
+        <w:jc w:val="left"/>
+        <w:tblLayout w:type="fixed"/>
+        <w:tblLook w:firstColumn="1" w:firstRow="1" w:lastColumn="0" w:lastRow="0" w:noHBand="0" w:noVBand="1" w:val="04A0"/>
+        <w:tblBorders>
+          <w:top w:val="single" w:sz="6" w:color="D9D9D9"/>
+          <w:left w:val="single" w:sz="6" w:color="D9D9D9"/>
+          <w:bottom w:val="single" w:sz="6" w:color="D9D9D9"/>
+          <w:right w:val="single" w:sz="6" w:color="D9D9D9"/>
+          <w:insideH w:val="single" w:sz="6" w:color="D9D9D9"/>
+          <w:insideV w:val="single" w:sz="6" w:color="D9D9D9"/>
+        </w:tblBorders>
+        <w:tblInd w:w="120" w:type="dxa"/>
+      </w:tblPr>
+      <w:tblGrid>
+        <w:gridCol w:w="2300"/>
+        <w:gridCol w:w="2050"/>
+        <w:gridCol w:w="2050"/>
+        <w:gridCol w:w="2456"/>
+      </w:tblGrid>
+      <w:tr>
+        <w:trPr>
+          <w:tblHeader w:val="true"/>
+          <w:cantSplit w:val="true"/>
+        </w:trPr>
+        <w:tc>
+          <w:tcPr>
+            <w:tcW w:type="dxa" w:w="2300"/>
+            <w:shd w:fill="FFFFFF"/>
+            <w:vAlign w:val="center"/>
+            <w:tcMar>
+              <w:top w:w="50" w:type="dxa"/>
+              <w:start w:w="100" w:type="dxa"/>
+              <w:bottom w:w="50" w:type="dxa"/>
+              <w:end w:w="100" w:type="dxa"/>
+            </w:tcMar>
+          </w:tcPr>
+          <w:p>
+            <w:pPr>
+              <w:keepNext/>
+              <w:spacing w:after="0"/>
+              <w:jc w:val="center"/>
+            </w:pPr>
+            <w:r>
+              <w:rPr>
+                <w:rFonts w:ascii="Times New Roman" w:hAnsi="Times New Roman" w:eastAsia="Times New Roman"/>
+                <w:b/>
+                <w:sz w:val="20"/>
+              </w:rPr>
+              <w:t>Time tương đối</w:t>
+            </w:r>
+          </w:p>
+        </w:tc>
+        <w:tc>
+          <w:tcPr>
+            <w:tcW w:type="dxa" w:w="2050"/>
+            <w:shd w:fill="FFFFFF"/>
+            <w:vAlign w:val="center"/>
+            <w:tcMar>
+              <w:top w:w="50" w:type="dxa"/>
+              <w:start w:w="100" w:type="dxa"/>
+              <w:bottom w:w="50" w:type="dxa"/>
+              <w:end w:w="100" w:type="dxa"/>
+            </w:tcMar>
+          </w:tcPr>
+          <w:p>
+            <w:pPr>
+              <w:keepNext/>
+              <w:spacing w:after="0"/>
+              <w:jc w:val="center"/>
+            </w:pPr>
+            <w:r>
+              <w:rPr>
+                <w:rFonts w:ascii="Times New Roman" w:hAnsi="Times New Roman" w:eastAsia="Times New Roman"/>
+                <w:b/>
+                <w:sz w:val="20"/>
+              </w:rPr>
+              <w:t>Class 0</w:t>
+            </w:r>
+          </w:p>
+        </w:tc>
+        <w:tc>
+          <w:tcPr>
+            <w:tcW w:type="dxa" w:w="2050"/>
+            <w:shd w:fill="FFFFFF"/>
+            <w:vAlign w:val="center"/>
+            <w:tcMar>
+              <w:top w:w="50" w:type="dxa"/>
+              <w:start w:w="100" w:type="dxa"/>
+              <w:bottom w:w="50" w:type="dxa"/>
+              <w:end w:w="100" w:type="dxa"/>
+            </w:tcMar>
+          </w:tcPr>
+          <w:p>
+            <w:pPr>
+              <w:keepNext/>
+              <w:spacing w:after="0"/>
+              <w:jc w:val="center"/>
+            </w:pPr>
+            <w:r>
+              <w:rPr>
+                <w:rFonts w:ascii="Times New Roman" w:hAnsi="Times New Roman" w:eastAsia="Times New Roman"/>
+                <w:b/>
+                <w:sz w:val="20"/>
+              </w:rPr>
+              <w:t>Class 1</w:t>
+            </w:r>
+          </w:p>
+        </w:tc>
+        <w:tc>
+          <w:tcPr>
+            <w:tcW w:type="dxa" w:w="2456"/>
+            <w:shd w:fill="FFFFFF"/>
+            <w:vAlign w:val="center"/>
+            <w:tcMar>
+              <w:top w:w="50" w:type="dxa"/>
+              <w:start w:w="100" w:type="dxa"/>
+              <w:bottom w:w="50" w:type="dxa"/>
+              <w:end w:w="100" w:type="dxa"/>
+            </w:tcMar>
+          </w:tcPr>
+          <w:p>
+            <w:pPr>
+              <w:keepNext/>
+              <w:spacing w:after="0"/>
+              <w:jc w:val="center"/>
+            </w:pPr>
+            <w:r>
+              <w:rPr>
+                <w:rFonts w:ascii="Times New Roman" w:hAnsi="Times New Roman" w:eastAsia="Times New Roman"/>
+                <w:b/>
+                <w:sz w:val="20"/>
+              </w:rPr>
+              <w:t>Tỷ lệ fraud</w:t>
+            </w:r>
+          </w:p>
+        </w:tc>
+      </w:tr>
+      <w:tr>
+        <w:trPr>
+          <w:cantSplit w:val="true"/>
+        </w:trPr>
+        <w:tc>
+          <w:tcPr>
+            <w:tcW w:type="dxa" w:w="2300"/>
+            <w:vAlign w:val="center"/>
+            <w:tcMar>
+              <w:top w:w="50" w:type="dxa"/>
+              <w:start w:w="100" w:type="dxa"/>
+              <w:bottom w:w="50" w:type="dxa"/>
+              <w:end w:w="100" w:type="dxa"/>
+            </w:tcMar>
+          </w:tcPr>
+          <w:p>
+            <w:pPr>
+              <w:keepNext/>
+              <w:spacing w:after="0"/>
+              <w:jc w:val="left"/>
+            </w:pPr>
+            <w:r>
+              <w:rPr>
+                <w:rFonts w:ascii="Times New Roman" w:hAnsi="Times New Roman" w:eastAsia="Times New Roman"/>
+                <w:sz w:val="20"/>
+              </w:rPr>
+              <w:t>0–12 giờ</w:t>
+            </w:r>
+          </w:p>
+        </w:tc>
+        <w:tc>
+          <w:tcPr>
+            <w:tcW w:type="dxa" w:w="2050"/>
+            <w:vAlign w:val="center"/>
+            <w:tcMar>
+              <w:top w:w="50" w:type="dxa"/>
+              <w:start w:w="100" w:type="dxa"/>
+              <w:bottom w:w="50" w:type="dxa"/>
+              <w:end w:w="100" w:type="dxa"/>
+            </w:tcMar>
+          </w:tcPr>
+          <w:p>
+            <w:pPr>
+              <w:keepNext/>
+              <w:spacing w:after="0"/>
+              <w:jc w:val="center"/>
+            </w:pPr>
+            <w:r>
+              <w:rPr>
+                <w:rFonts w:ascii="Times New Roman" w:hAnsi="Times New Roman" w:eastAsia="Times New Roman"/>
+                <w:sz w:val="20"/>
+              </w:rPr>
+              <w:t>28257</w:t>
+            </w:r>
+          </w:p>
+        </w:tc>
+        <w:tc>
+          <w:tcPr>
+            <w:tcW w:type="dxa" w:w="2050"/>
+            <w:vAlign w:val="center"/>
+            <w:tcMar>
+              <w:top w:w="50" w:type="dxa"/>
+              <w:start w:w="100" w:type="dxa"/>
+              <w:bottom w:w="50" w:type="dxa"/>
+              <w:end w:w="100" w:type="dxa"/>
+            </w:tcMar>
+          </w:tcPr>
+          <w:p>
+            <w:pPr>
+              <w:keepNext/>
+              <w:spacing w:after="0"/>
+              <w:jc w:val="center"/>
+            </w:pPr>
+            <w:r>
+              <w:rPr>
+                <w:rFonts w:ascii="Times New Roman" w:hAnsi="Times New Roman" w:eastAsia="Times New Roman"/>
+                <w:sz w:val="20"/>
+              </w:rPr>
+              <w:t>91</w:t>
+            </w:r>
+          </w:p>
+        </w:tc>
+        <w:tc>
+          <w:tcPr>
+            <w:tcW w:type="dxa" w:w="2456"/>
+            <w:vAlign w:val="center"/>
+            <w:tcMar>
+              <w:top w:w="50" w:type="dxa"/>
+              <w:start w:w="100" w:type="dxa"/>
+              <w:bottom w:w="50" w:type="dxa"/>
+              <w:end w:w="100" w:type="dxa"/>
+            </w:tcMar>
+          </w:tcPr>
+          <w:p>
+            <w:pPr>
+              <w:keepNext/>
+              <w:spacing w:after="0"/>
+              <w:jc w:val="center"/>
+            </w:pPr>
+            <w:r>
+              <w:rPr>
+                <w:rFonts w:ascii="Times New Roman" w:hAnsi="Times New Roman" w:eastAsia="Times New Roman"/>
+                <w:sz w:val="20"/>
+              </w:rPr>
+              <w:t>0,321%</w:t>
+            </w:r>
+          </w:p>
+        </w:tc>
+      </w:tr>
+      <w:tr>
+        <w:trPr>
+          <w:cantSplit w:val="true"/>
+        </w:trPr>
+        <w:tc>
+          <w:tcPr>
+            <w:tcW w:type="dxa" w:w="2300"/>
+            <w:shd w:fill="FFFFFF"/>
+            <w:vAlign w:val="center"/>
+            <w:tcMar>
+              <w:top w:w="50" w:type="dxa"/>
+              <w:start w:w="100" w:type="dxa"/>
+              <w:bottom w:w="50" w:type="dxa"/>
+              <w:end w:w="100" w:type="dxa"/>
+            </w:tcMar>
+          </w:tcPr>
+          <w:p>
+            <w:pPr>
+              <w:keepNext/>
+              <w:spacing w:after="0"/>
+              <w:jc w:val="left"/>
+            </w:pPr>
+            <w:r>
+              <w:rPr>
+                <w:rFonts w:ascii="Times New Roman" w:hAnsi="Times New Roman" w:eastAsia="Times New Roman"/>
+                <w:sz w:val="20"/>
+              </w:rPr>
+              <w:t>12–24 giờ</w:t>
+            </w:r>
+          </w:p>
+        </w:tc>
+        <w:tc>
+          <w:tcPr>
+            <w:tcW w:type="dxa" w:w="2050"/>
+            <w:shd w:fill="FFFFFF"/>
+            <w:vAlign w:val="center"/>
+            <w:tcMar>
+              <w:top w:w="50" w:type="dxa"/>
+              <w:start w:w="100" w:type="dxa"/>
+              <w:bottom w:w="50" w:type="dxa"/>
+              <w:end w:w="100" w:type="dxa"/>
+            </w:tcMar>
+          </w:tcPr>
+          <w:p>
+            <w:pPr>
+              <w:keepNext/>
+              <w:spacing w:after="0"/>
+              <w:jc w:val="center"/>
+            </w:pPr>
+            <w:r>
+              <w:rPr>
+                <w:rFonts w:ascii="Times New Roman" w:hAnsi="Times New Roman" w:eastAsia="Times New Roman"/>
+                <w:sz w:val="20"/>
+              </w:rPr>
+              <w:t>57895</w:t>
+            </w:r>
+          </w:p>
+        </w:tc>
+        <w:tc>
+          <w:tcPr>
+            <w:tcW w:type="dxa" w:w="2050"/>
+            <w:shd w:fill="FFFFFF"/>
+            <w:vAlign w:val="center"/>
+            <w:tcMar>
+              <w:top w:w="50" w:type="dxa"/>
+              <w:start w:w="100" w:type="dxa"/>
+              <w:bottom w:w="50" w:type="dxa"/>
+              <w:end w:w="100" w:type="dxa"/>
+            </w:tcMar>
+          </w:tcPr>
+          <w:p>
+            <w:pPr>
+              <w:keepNext/>
+              <w:spacing w:after="0"/>
+              <w:jc w:val="center"/>
+            </w:pPr>
+            <w:r>
+              <w:rPr>
+                <w:rFonts w:ascii="Times New Roman" w:hAnsi="Times New Roman" w:eastAsia="Times New Roman"/>
+                <w:sz w:val="20"/>
+              </w:rPr>
+              <w:t>68</w:t>
+            </w:r>
+          </w:p>
+        </w:tc>
+        <w:tc>
+          <w:tcPr>
+            <w:tcW w:type="dxa" w:w="2456"/>
+            <w:shd w:fill="FFFFFF"/>
+            <w:vAlign w:val="center"/>
+            <w:tcMar>
+              <w:top w:w="50" w:type="dxa"/>
+              <w:start w:w="100" w:type="dxa"/>
+              <w:bottom w:w="50" w:type="dxa"/>
+              <w:end w:w="100" w:type="dxa"/>
+            </w:tcMar>
+          </w:tcPr>
+          <w:p>
+            <w:pPr>
+              <w:keepNext/>
+              <w:spacing w:after="0"/>
+              <w:jc w:val="center"/>
+            </w:pPr>
+            <w:r>
+              <w:rPr>
+                <w:rFonts w:ascii="Times New Roman" w:hAnsi="Times New Roman" w:eastAsia="Times New Roman"/>
+                <w:sz w:val="20"/>
+              </w:rPr>
+              <w:t>0,117%</w:t>
+            </w:r>
+          </w:p>
+        </w:tc>
+      </w:tr>
+      <w:tr>
+        <w:trPr>
+          <w:cantSplit w:val="true"/>
+        </w:trPr>
+        <w:tc>
+          <w:tcPr>
+            <w:tcW w:type="dxa" w:w="2300"/>
+            <w:vAlign w:val="center"/>
+            <w:tcMar>
+              <w:top w:w="50" w:type="dxa"/>
+              <w:start w:w="100" w:type="dxa"/>
+              <w:bottom w:w="50" w:type="dxa"/>
+              <w:end w:w="100" w:type="dxa"/>
+            </w:tcMar>
+          </w:tcPr>
+          <w:p>
+            <w:pPr>
+              <w:keepNext/>
+              <w:spacing w:after="0"/>
+              <w:jc w:val="left"/>
+            </w:pPr>
+            <w:r>
+              <w:rPr>
+                <w:rFonts w:ascii="Times New Roman" w:hAnsi="Times New Roman" w:eastAsia="Times New Roman"/>
+                <w:sz w:val="20"/>
+              </w:rPr>
+              <w:t>24–36 giờ</w:t>
+            </w:r>
+          </w:p>
+        </w:tc>
+        <w:tc>
+          <w:tcPr>
+            <w:tcW w:type="dxa" w:w="2050"/>
+            <w:vAlign w:val="center"/>
+            <w:tcMar>
+              <w:top w:w="50" w:type="dxa"/>
+              <w:start w:w="100" w:type="dxa"/>
+              <w:bottom w:w="50" w:type="dxa"/>
+              <w:end w:w="100" w:type="dxa"/>
+            </w:tcMar>
+          </w:tcPr>
+          <w:p>
+            <w:pPr>
+              <w:keepNext/>
+              <w:spacing w:after="0"/>
+              <w:jc w:val="center"/>
+            </w:pPr>
+            <w:r>
+              <w:rPr>
+                <w:rFonts w:ascii="Times New Roman" w:hAnsi="Times New Roman" w:eastAsia="Times New Roman"/>
+                <w:sz w:val="20"/>
+              </w:rPr>
+              <w:t>28303</w:t>
+            </w:r>
+          </w:p>
+        </w:tc>
+        <w:tc>
+          <w:tcPr>
+            <w:tcW w:type="dxa" w:w="2050"/>
+            <w:vAlign w:val="center"/>
+            <w:tcMar>
+              <w:top w:w="50" w:type="dxa"/>
+              <w:start w:w="100" w:type="dxa"/>
+              <w:bottom w:w="50" w:type="dxa"/>
+              <w:end w:w="100" w:type="dxa"/>
+            </w:tcMar>
+          </w:tcPr>
+          <w:p>
+            <w:pPr>
+              <w:keepNext/>
+              <w:spacing w:after="0"/>
+              <w:jc w:val="center"/>
+            </w:pPr>
+            <w:r>
+              <w:rPr>
+                <w:rFonts w:ascii="Times New Roman" w:hAnsi="Times New Roman" w:eastAsia="Times New Roman"/>
+                <w:sz w:val="20"/>
+              </w:rPr>
+              <w:t>53</w:t>
+            </w:r>
+          </w:p>
+        </w:tc>
+        <w:tc>
+          <w:tcPr>
+            <w:tcW w:type="dxa" w:w="2456"/>
+            <w:vAlign w:val="center"/>
+            <w:tcMar>
+              <w:top w:w="50" w:type="dxa"/>
+              <w:start w:w="100" w:type="dxa"/>
+              <w:bottom w:w="50" w:type="dxa"/>
+              <w:end w:w="100" w:type="dxa"/>
+            </w:tcMar>
+          </w:tcPr>
+          <w:p>
+            <w:pPr>
+              <w:keepNext/>
+              <w:spacing w:after="0"/>
+              <w:jc w:val="center"/>
+            </w:pPr>
+            <w:r>
+              <w:rPr>
+                <w:rFonts w:ascii="Times New Roman" w:hAnsi="Times New Roman" w:eastAsia="Times New Roman"/>
+                <w:sz w:val="20"/>
+              </w:rPr>
+              <w:t>0,187%</w:t>
+            </w:r>
+          </w:p>
+        </w:tc>
+      </w:tr>
+      <w:tr>
+        <w:trPr>
+          <w:cantSplit w:val="true"/>
+        </w:trPr>
+        <w:tc>
+          <w:tcPr>
+            <w:tcW w:type="dxa" w:w="2300"/>
+            <w:shd w:fill="FFFFFF"/>
+            <w:vAlign w:val="center"/>
+            <w:tcMar>
+              <w:top w:w="50" w:type="dxa"/>
+              <w:start w:w="100" w:type="dxa"/>
+              <w:bottom w:w="50" w:type="dxa"/>
+              <w:end w:w="100" w:type="dxa"/>
+            </w:tcMar>
+          </w:tcPr>
+          <w:p>
+            <w:pPr>
+              <w:spacing w:after="0"/>
+              <w:jc w:val="left"/>
+            </w:pPr>
+            <w:r>
+              <w:rPr>
+                <w:rFonts w:ascii="Times New Roman" w:hAnsi="Times New Roman" w:eastAsia="Times New Roman"/>
+                <w:sz w:val="20"/>
+              </w:rPr>
+              <w:t>36–48+ giờ</w:t>
+            </w:r>
+          </w:p>
+        </w:tc>
+        <w:tc>
+          <w:tcPr>
+            <w:tcW w:type="dxa" w:w="2050"/>
+            <w:shd w:fill="FFFFFF"/>
+            <w:vAlign w:val="center"/>
+            <w:tcMar>
+              <w:top w:w="50" w:type="dxa"/>
+              <w:start w:w="100" w:type="dxa"/>
+              <w:bottom w:w="50" w:type="dxa"/>
+              <w:end w:w="100" w:type="dxa"/>
+            </w:tcMar>
+          </w:tcPr>
+          <w:p>
+            <w:pPr>
+              <w:spacing w:after="0"/>
+              <w:jc w:val="center"/>
+            </w:pPr>
+            <w:r>
+              <w:rPr>
+                <w:rFonts w:ascii="Times New Roman" w:hAnsi="Times New Roman" w:eastAsia="Times New Roman"/>
+                <w:sz w:val="20"/>
+              </w:rPr>
+              <w:t>55496</w:t>
+            </w:r>
+          </w:p>
+        </w:tc>
+        <w:tc>
+          <w:tcPr>
+            <w:tcW w:type="dxa" w:w="2050"/>
+            <w:shd w:fill="FFFFFF"/>
+            <w:vAlign w:val="center"/>
+            <w:tcMar>
+              <w:top w:w="50" w:type="dxa"/>
+              <w:start w:w="100" w:type="dxa"/>
+              <w:bottom w:w="50" w:type="dxa"/>
+              <w:end w:w="100" w:type="dxa"/>
+            </w:tcMar>
+          </w:tcPr>
+          <w:p>
+            <w:pPr>
+              <w:spacing w:after="0"/>
+              <w:jc w:val="center"/>
+            </w:pPr>
+            <w:r>
+              <w:rPr>
+                <w:rFonts w:ascii="Times New Roman" w:hAnsi="Times New Roman" w:eastAsia="Times New Roman"/>
+                <w:sz w:val="20"/>
+              </w:rPr>
+              <w:t>72</w:t>
+            </w:r>
+          </w:p>
+        </w:tc>
+        <w:tc>
+          <w:tcPr>
+            <w:tcW w:type="dxa" w:w="2456"/>
+            <w:shd w:fill="FFFFFF"/>
+            <w:vAlign w:val="center"/>
+            <w:tcMar>
+              <w:top w:w="50" w:type="dxa"/>
+              <w:start w:w="100" w:type="dxa"/>
+              <w:bottom w:w="50" w:type="dxa"/>
+              <w:end w:w="100" w:type="dxa"/>
+            </w:tcMar>
+          </w:tcPr>
+          <w:p>
+            <w:pPr>
+              <w:spacing w:after="0"/>
+              <w:jc w:val="center"/>
+            </w:pPr>
+            <w:r>
+              <w:rPr>
+                <w:rFonts w:ascii="Times New Roman" w:hAnsi="Times New Roman" w:eastAsia="Times New Roman"/>
+                <w:sz w:val="20"/>
+              </w:rPr>
+              <w:t>0,130%</w:t>
+            </w:r>
+          </w:p>
+        </w:tc>
+      </w:tr>
+    </w:tbl>
+    <w:p>
+      <w:pPr>
+        <w:spacing w:line="40" w:lineRule="exact" w:after="80"/>
+      </w:pPr>
+      <w:r>
+        <w:rPr>
+          <w:sz w:val="4"/>
+        </w:rPr>
+      </w:r>
+    </w:p>
+    <w:p>
+      <w:pPr>
+        <w:spacing w:line="300" w:lineRule="auto" w:after="80"/>
+        <w:ind w:firstLine="720"/>
+        <w:jc w:val="both"/>
+      </w:pPr>
+      <w:r>
+        <w:rPr>
+          <w:rFonts w:ascii="Times New Roman" w:hAnsi="Times New Roman" w:eastAsia="Times New Roman"/>
+          <w:i w:val="0"/>
+          <w:sz w:val="26"/>
+        </w:rPr>
+        <w:t>Bảng pivot đếm từng dòng train theo bốn cửa sổ Time và Class. Time là giây tương đối nên các cửa sổ này không mô tả giờ trong ngày hay xu hướng ở dữ liệu tương lai.</w:t>
+      </w:r>
+    </w:p>
+    <w:p>
+      <w:pPr>
+        <w:pStyle w:val="Caption"/>
+        <w:keepNext/>
+        <w:spacing w:before="100" w:after="60"/>
+        <w:jc w:val="center"/>
+      </w:pPr>
+      <w:r>
+        <w:rPr>
+          <w:rFonts w:ascii="Times New Roman" w:hAnsi="Times New Roman" w:eastAsia="Times New Roman"/>
+          <w:b/>
+          <w:color w:val="000000"/>
+          <w:sz w:val="21"/>
+        </w:rPr>
+        <w:t>Hình 3.5. Seaborn đa biến trên train</w:t>
+      </w:r>
+    </w:p>
+    <w:p>
+      <w:pPr>
+        <w:keepNext/>
+        <w:jc w:val="center"/>
+      </w:pPr>
+      <w:r>
+        <w:drawing>
+          <wp:inline xmlns:a="http://schemas.openxmlformats.org/drawingml/2006/main" xmlns:pic="http://schemas.openxmlformats.org/drawingml/2006/picture">
+            <wp:extent cx="5029200" cy="3325558"/>
+            <wp:docPr id="1149450721" name="Picture 1149450721" descr="Hình 3.5. Seaborn đa biến trên train"/>
+            <wp:cNvGraphicFramePr>
+              <a:graphicFrameLocks noChangeAspect="1"/>
+            </wp:cNvGraphicFramePr>
+            <a:graphic>
+              <a:graphicData uri="http://schemas.openxmlformats.org/drawingml/2006/picture">
+                <pic:pic>
+                  <pic:nvPicPr>
+                    <pic:cNvPr id="0" name="eda_seaborn_multivariate.png"/>
+                    <pic:cNvPicPr/>
+                  </pic:nvPicPr>
+                  <pic:blipFill>
+                    <a:blip r:embed="rId30"/>
+                    <a:stretch>
+                      <a:fillRect/>
+                    </a:stretch>
+                  </pic:blipFill>
+                  <pic:spPr>
+                    <a:xfrm>
+                      <a:off x="0" y="0"/>
+                      <a:ext cx="5029200" cy="3325558"/>
+                    </a:xfrm>
+                    <a:prstGeom prst="rect"/>
+                  </pic:spPr>
+                </pic:pic>
+              </a:graphicData>
+            </a:graphic>
+          </wp:inline>
+        </w:drawing>
+      </w:r>
+    </w:p>
+    <w:p>
+      <w:pPr>
+        <w:spacing w:line="300" w:lineRule="auto" w:after="140"/>
+        <w:jc w:val="both"/>
+      </w:pPr>
+      <w:r>
+        <w:rPr>
+          <w:rFonts w:ascii="Times New Roman" w:hAnsi="Times New Roman" w:eastAsia="Times New Roman"/>
+          <w:i/>
+          <w:sz w:val="26"/>
+        </w:rPr>
+        <w:t>Hai trục biểu diễn V14 và V17, màu chỉ Class, còn cỡ điểm biểu diễn LogAmount. Hình giữ toàn bộ 284 fraud và lấy mẫu 5.000 giao dịch hợp lệ để lớp hiếm nhìn rõ; tỷ lệ màu không đại diện cho prevalence, và hai lớp vẫn có vùng chồng lấp.</w:t>
       </w:r>
     </w:p>
     <w:p>
@@ -7960,7 +8669,7 @@
           <w:color w:val="000000"/>
           <w:sz w:val="21"/>
         </w:rPr>
-        <w:t>Bảng 3.3. So sánh validation và metric tại threshold tối đa F1</w:t>
+        <w:t>Bảng 3.4. So sánh validation và metric tại threshold tối đa F1</w:t>
       </w:r>
     </w:p>
     <w:tbl>
@@ -8899,7 +9608,7 @@
           <w:color w:val="000000"/>
           <w:sz w:val="21"/>
         </w:rPr>
-        <w:t>Hình 3.5. Precision Recall trên validation</w:t>
+        <w:t>Hình 3.6. Precision Recall trên validation</w:t>
       </w:r>
     </w:p>
     <w:p>
@@ -8911,7 +9620,7 @@
         <w:drawing>
           <wp:inline xmlns:a="http://schemas.openxmlformats.org/drawingml/2006/main" xmlns:pic="http://schemas.openxmlformats.org/drawingml/2006/picture">
             <wp:extent cx="5394960" cy="3932725"/>
-            <wp:docPr id="1149450721" name="Picture 1149450721" descr="Hình 3.5. Precision Recall trên validation"/>
+            <wp:docPr id="1149450722" name="Picture 1149450722" descr="Hình 3.6. Precision Recall trên validation"/>
             <wp:cNvGraphicFramePr>
               <a:graphicFrameLocks noChangeAspect="1"/>
             </wp:cNvGraphicFramePr>
@@ -8923,7 +9632,7 @@
                     <pic:cNvPicPr/>
                   </pic:nvPicPr>
                   <pic:blipFill>
-                    <a:blip r:embed="rId30"/>
+                    <a:blip r:embed="rId31"/>
                     <a:stretch>
                       <a:fillRect/>
                     </a:stretch>
@@ -8988,7 +9697,7 @@
           <w:color w:val="000000"/>
           <w:sz w:val="21"/>
         </w:rPr>
-        <w:t>Bảng 3.4a. Hiệu quả xếp hạng của model đã khóa trên test</w:t>
+        <w:t>Bảng 3.5a. Hiệu quả xếp hạng của model đã khóa trên test</w:t>
       </w:r>
     </w:p>
     <w:tbl>
@@ -9316,7 +10025,7 @@
           <w:color w:val="000000"/>
           <w:sz w:val="21"/>
         </w:rPr>
-        <w:t>Bảng 3.4b. Kết quả tại threshold đã khóa</w:t>
+        <w:t>Bảng 3.5b. Kết quả tại threshold đã khóa</w:t>
       </w:r>
     </w:p>
     <w:tbl>
@@ -9821,7 +10530,7 @@
           <w:color w:val="000000"/>
           <w:sz w:val="21"/>
         </w:rPr>
-        <w:t>Hình 3.6. Precision-Recall trên test đã khóa</w:t>
+        <w:t>Hình 3.7. Precision-Recall trên test đã khóa</w:t>
       </w:r>
     </w:p>
     <w:p>
@@ -9833,7 +10542,7 @@
         <w:drawing>
           <wp:inline xmlns:a="http://schemas.openxmlformats.org/drawingml/2006/main" xmlns:pic="http://schemas.openxmlformats.org/drawingml/2006/picture">
             <wp:extent cx="5394960" cy="3932725"/>
-            <wp:docPr id="1149450722" name="Picture 1149450722" descr="Hình 3.6. Precision-Recall trên test đã khóa"/>
+            <wp:docPr id="1149450723" name="Picture 1149450723" descr="Hình 3.7. Precision-Recall trên test đã khóa"/>
             <wp:cNvGraphicFramePr>
               <a:graphicFrameLocks noChangeAspect="1"/>
             </wp:cNvGraphicFramePr>
@@ -9845,7 +10554,7 @@
                     <pic:cNvPicPr/>
                   </pic:nvPicPr>
                   <pic:blipFill>
-                    <a:blip r:embed="rId31"/>
+                    <a:blip r:embed="rId32"/>
                     <a:stretch>
                       <a:fillRect/>
                     </a:stretch>
@@ -9875,7 +10584,7 @@
           <w:i/>
           <w:sz w:val="26"/>
         </w:rPr>
-        <w:t>AP được tính trực tiếp từ score liên tục bằng average_precision_score; test không được dùng để đổi model hoặc threshold.</w:t>
+        <w:t>AP được tính trực tiếp từ score liên tục bằng average_precision_score. Đường PR trên test chỉ dùng để mô tả kết quả sau khi khóa mô hình và ngưỡng trên validation.</w:t>
       </w:r>
     </w:p>
     <w:p>
@@ -9892,7 +10601,7 @@
           <w:color w:val="000000"/>
           <w:sz w:val="21"/>
         </w:rPr>
-        <w:t>Hình 3.7. Confusion matrix tại threshold đã khóa</w:t>
+        <w:t>Hình 3.8. Confusion matrix tại threshold đã khóa</w:t>
       </w:r>
     </w:p>
     <w:p>
@@ -9904,7 +10613,7 @@
         <w:drawing>
           <wp:inline xmlns:a="http://schemas.openxmlformats.org/drawingml/2006/main" xmlns:pic="http://schemas.openxmlformats.org/drawingml/2006/picture">
             <wp:extent cx="5394960" cy="4353487"/>
-            <wp:docPr id="1149450723" name="Picture 1149450723" descr="Hình 3.7. Confusion matrix tại threshold đã khóa"/>
+            <wp:docPr id="1149450724" name="Picture 1149450724" descr="Hình 3.8. Confusion matrix tại threshold đã khóa"/>
             <wp:cNvGraphicFramePr>
               <a:graphicFrameLocks noChangeAspect="1"/>
             </wp:cNvGraphicFramePr>
@@ -9916,7 +10625,7 @@
                     <pic:cNvPicPr/>
                   </pic:nvPicPr>
                   <pic:blipFill>
-                    <a:blip r:embed="rId32"/>
+                    <a:blip r:embed="rId33"/>
                     <a:stretch>
                       <a:fillRect/>
                     </a:stretch>
@@ -9980,7 +10689,7 @@
           <w:color w:val="000000"/>
           <w:sz w:val="21"/>
         </w:rPr>
-        <w:t>Bảng 3.5. Hiệu quả theo năng lực kiểm tra</w:t>
+        <w:t>Bảng 3.6. Hiệu quả theo năng lực kiểm tra</w:t>
       </w:r>
     </w:p>
     <w:tbl>
@@ -10812,7 +11521,7 @@
           <w:color w:val="000000"/>
           <w:sz w:val="21"/>
         </w:rPr>
-        <w:t>Hình 3.8. Recall và Lift theo Top-p</w:t>
+        <w:t>Hình 3.9. Recall và Lift theo Top-p</w:t>
       </w:r>
     </w:p>
     <w:p>
@@ -10824,7 +11533,7 @@
         <w:drawing>
           <wp:inline xmlns:a="http://schemas.openxmlformats.org/drawingml/2006/main" xmlns:pic="http://schemas.openxmlformats.org/drawingml/2006/picture">
             <wp:extent cx="5394960" cy="2409724"/>
-            <wp:docPr id="1149450724" name="Picture 1149450724" descr="Hình 3.8. Recall và Lift theo Top-p"/>
+            <wp:docPr id="1149450725" name="Picture 1149450725" descr="Hình 3.9. Recall và Lift theo Top-p"/>
             <wp:cNvGraphicFramePr>
               <a:graphicFrameLocks noChangeAspect="1"/>
             </wp:cNvGraphicFramePr>
@@ -10836,7 +11545,7 @@
                     <pic:cNvPicPr/>
                   </pic:nvPicPr>
                   <pic:blipFill>
-                    <a:blip r:embed="rId33"/>
+                    <a:blip r:embed="rId34"/>
                     <a:stretch>
                       <a:fillRect/>
                     </a:stretch>
@@ -10866,7 +11575,7 @@
           <w:i/>
           <w:sz w:val="26"/>
         </w:rPr>
-        <w:t>Recall tăng chậm khi mở rộng p, trong khi Lift giảm mạnh vì danh sách chứa nhiều giao dịch hợp lệ hơn.</w:t>
+        <w:t>Recall tăng khi mở rộng p, trong khi Lift giảm vì danh sách chứa thêm giao dịch hợp lệ. Chọn p theo năng lực kiểm tra; không thể coi cùng một p là tối ưu cho mọi chi phí vận hành.</w:t>
       </w:r>
     </w:p>
     <w:p>
@@ -10900,7 +11609,7 @@
           <w:color w:val="000000"/>
           <w:sz w:val="21"/>
         </w:rPr>
-        <w:t>Bảng 3.6. Mẫu lỗi được kiểm tra</w:t>
+        <w:t>Bảng 3.7. Mẫu lỗi được kiểm tra</w:t>
       </w:r>
     </w:p>
     <w:tbl>
@@ -11275,6 +11984,77 @@
     </w:p>
     <w:p>
       <w:pPr>
+        <w:pStyle w:val="Caption"/>
+        <w:keepNext/>
+        <w:spacing w:before="100" w:after="60"/>
+        <w:jc w:val="center"/>
+      </w:pPr>
+      <w:r>
+        <w:rPr>
+          <w:rFonts w:ascii="Times New Roman" w:hAnsi="Times New Roman" w:eastAsia="Times New Roman"/>
+          <w:b/>
+          <w:color w:val="000000"/>
+          <w:sz w:val="21"/>
+        </w:rPr>
+        <w:t>Hình 3.10. Seaborn đa biến trên mẫu FP/FN của test đã khóa</w:t>
+      </w:r>
+    </w:p>
+    <w:p>
+      <w:pPr>
+        <w:keepNext/>
+        <w:jc w:val="center"/>
+      </w:pPr>
+      <w:r>
+        <w:drawing>
+          <wp:inline xmlns:a="http://schemas.openxmlformats.org/drawingml/2006/main" xmlns:pic="http://schemas.openxmlformats.org/drawingml/2006/picture">
+            <wp:extent cx="5029200" cy="2689559"/>
+            <wp:docPr id="1149450726" name="Picture 1149450726" descr="Hình 3.10. Seaborn đa biến trên mẫu FP/FN của test đã khóa"/>
+            <wp:cNvGraphicFramePr>
+              <a:graphicFrameLocks noChangeAspect="1"/>
+            </wp:cNvGraphicFramePr>
+            <a:graphic>
+              <a:graphicData uri="http://schemas.openxmlformats.org/drawingml/2006/picture">
+                <pic:pic>
+                  <pic:nvPicPr>
+                    <pic:cNvPr id="0" name="seaborn_error_cases_multivariate.png"/>
+                    <pic:cNvPicPr/>
+                  </pic:nvPicPr>
+                  <pic:blipFill>
+                    <a:blip r:embed="rId35"/>
+                    <a:stretch>
+                      <a:fillRect/>
+                    </a:stretch>
+                  </pic:blipFill>
+                  <pic:spPr>
+                    <a:xfrm>
+                      <a:off x="0" y="0"/>
+                      <a:ext cx="5029200" cy="2689559"/>
+                    </a:xfrm>
+                    <a:prstGeom prst="rect"/>
+                  </pic:spPr>
+                </pic:pic>
+              </a:graphicData>
+            </a:graphic>
+          </wp:inline>
+        </w:drawing>
+      </w:r>
+    </w:p>
+    <w:p>
+      <w:pPr>
+        <w:spacing w:line="300" w:lineRule="auto" w:after="140"/>
+        <w:jc w:val="both"/>
+      </w:pPr>
+      <w:r>
+        <w:rPr>
+          <w:rFonts w:ascii="Times New Roman" w:hAnsi="Times New Roman" w:eastAsia="Times New Roman"/>
+          <w:i/>
+          <w:sz w:val="26"/>
+        </w:rPr>
+        <w:t>Mười cảnh báo nhầm và mười giao dịch bị bỏ sót được mô tả theo LogAmount, V14, loại lỗi và score. Đây là 20 trường hợp được chọn sau khi đánh giá test, không đại diện toàn bộ phân bố test và không dùng để thay đổi mô hình hoặc threshold.</w:t>
+      </w:r>
+    </w:p>
+    <w:p>
+      <w:pPr>
         <w:spacing w:line="300" w:lineRule="auto" w:after="80"/>
         <w:ind w:firstLine="720"/>
         <w:jc w:val="both"/>
@@ -11302,7 +12082,7 @@
           <w:color w:val="000000"/>
           <w:sz w:val="21"/>
         </w:rPr>
-        <w:t>Hình 3.9. Feature importance của Random Forest</w:t>
+        <w:t>Hình 3.11. Feature importance của Random Forest</w:t>
       </w:r>
     </w:p>
     <w:p>
@@ -11314,7 +12094,7 @@
         <w:drawing>
           <wp:inline xmlns:a="http://schemas.openxmlformats.org/drawingml/2006/main" xmlns:pic="http://schemas.openxmlformats.org/drawingml/2006/picture">
             <wp:extent cx="5394960" cy="4242425"/>
-            <wp:docPr id="1149450725" name="Picture 1149450725" descr="Hình 3.9. Feature importance của Random Forest"/>
+            <wp:docPr id="1149450727" name="Picture 1149450727" descr="Hình 3.11. Feature importance của Random Forest"/>
             <wp:cNvGraphicFramePr>
               <a:graphicFrameLocks noChangeAspect="1"/>
             </wp:cNvGraphicFramePr>
@@ -11326,7 +12106,7 @@
                     <pic:cNvPicPr/>
                   </pic:nvPicPr>
                   <pic:blipFill>
-                    <a:blip r:embed="rId34"/>
+                    <a:blip r:embed="rId36"/>
                     <a:stretch>
                       <a:fillRect/>
                     </a:stretch>
@@ -12146,7 +12926,7 @@
           <w:rFonts w:ascii="Times New Roman" w:hAnsi="Times New Roman" w:eastAsia="Times New Roman"/>
           <w:sz w:val="26"/>
         </w:rPr>
-        <w:t>EDA chỉ trên train và xuất bốn hình.</w:t>
+        <w:t>EDA chỉ trên train, pivot_table và năm hình gồm Seaborn đa biến.</w:t>
       </w:r>
     </w:p>
     <w:p>
@@ -13027,6 +13807,21 @@
           <w:sz w:val="26"/>
         </w:rPr>
         <w:t>[13] Nguyễn Mạnh Hùng, Python for Data Science, Buổi 1, ngày 17/08/2026, slide 26–30. Tài liệu học phần Cơ sở Khoa học Dữ liệu.</w:t>
+      </w:r>
+    </w:p>
+    <w:p>
+      <w:pPr>
+        <w:spacing w:line="240" w:lineRule="auto" w:after="80"/>
+        <w:ind w:left="360" w:hanging="360"/>
+        <w:jc w:val="left"/>
+      </w:pPr>
+      <w:r>
+        <w:rPr>
+          <w:rFonts w:ascii="Times New Roman" w:hAnsi="Times New Roman" w:eastAsia="Times New Roman"/>
+          <w:i w:val="0"/>
+          <w:sz w:val="26"/>
+        </w:rPr>
+        <w:t>[14] Nguyễn Mạnh Hùng, Python for Data Science, Buổi 9, ngày 19/08/2026, slide 77–78. Yêu cầu và cấu trúc đồ án giữa kỳ.</w:t>
       </w:r>
     </w:p>
     <w:sectPr>

</xml_diff>